<commit_message>
Velasquez Ch3: APA reference list folded into Draft_001
</commit_message>
<xml_diff>
--- a/thesis/Velasquez/Chapter3_Results_Analysis_Discussion_Draft_001.docx
+++ b/thesis/Velasquez/Chapter3_Results_Analysis_Discussion_Draft_001.docx
@@ -936,9 +936,9 @@
     </w:p>
     <w:p>
       <w:pPr>
-        <w:spacing w:line="480" w:lineRule="auto" w:before="240" w:after="0"/>
+        <w:spacing w:line="480" w:lineRule="auto" w:before="240" w:after="120"/>
         <w:ind w:firstLine="0"/>
-        <w:jc w:val="left"/>
+        <w:jc w:val="center"/>
       </w:pPr>
       <w:r>
         <w:rPr>
@@ -947,13 +947,14 @@
           <w:i w:val="0"/>
           <w:sz w:val="24"/>
         </w:rPr>
-        <w:t>References Cited in This Chapter</w:t>
+        <w:t>References</w:t>
       </w:r>
     </w:p>
     <w:p>
       <w:pPr>
         <w:spacing w:line="480" w:lineRule="auto" w:before="0" w:after="0"/>
-        <w:jc w:val="both"/>
+        <w:ind w:left="720" w:hanging="720"/>
+        <w:jc w:val="left"/>
       </w:pPr>
       <w:r>
         <w:rPr>
@@ -962,13 +963,14 @@
           <w:i w:val="0"/>
           <w:sz w:val="22"/>
         </w:rPr>
-        <w:t>Anggraini, &amp; Afriana. (2023). [Directive speech act subtypes operational definitions as cited in the thesis framework.]</w:t>
+        <w:t>Anggraini, &amp; Afriana. (2023). [Operational definitions of directive subtypes command, order, request, and suggestion, as applied in the thesis framework from Yule (1996)].</w:t>
       </w:r>
     </w:p>
     <w:p>
       <w:pPr>
         <w:spacing w:line="480" w:lineRule="auto" w:before="0" w:after="0"/>
-        <w:jc w:val="both"/>
+        <w:ind w:left="720" w:hanging="720"/>
+        <w:jc w:val="left"/>
       </w:pPr>
       <w:r>
         <w:rPr>
@@ -977,13 +979,14 @@
           <w:i w:val="0"/>
           <w:sz w:val="22"/>
         </w:rPr>
-        <w:t>De Castro, &amp; Martinez. (2025). [Facebook bank advertisements; ethos and pathos in Philippine digital advertising.]</w:t>
+        <w:t>De Castro, G. L., &amp; Martinez, S. P. (2025). Rhetorical appeals across selected Philippine bank advertising on Facebook. Southern Semiotic Review, (22). https://doi.org/10.33234/SSR.22.13</w:t>
       </w:r>
     </w:p>
     <w:p>
       <w:pPr>
         <w:spacing w:line="480" w:lineRule="auto" w:before="0" w:after="0"/>
-        <w:jc w:val="both"/>
+        <w:ind w:left="720" w:hanging="720"/>
+        <w:jc w:val="left"/>
       </w:pPr>
       <w:r>
         <w:rPr>
@@ -992,13 +995,14 @@
           <w:i w:val="0"/>
           <w:sz w:val="22"/>
         </w:rPr>
-        <w:t>Dwiyanti, W. G. (2024). Persuasive techniques in makeup and skincare video advertisements. Jurnal Linguistik Terapan, 1, 27–37. https://jurnal.polinema.ac.id/index.php/jlt/article/view/4558</w:t>
+        <w:t>Dwiyanti, W. G. (2024). Persuasive techniques in makeup and skincare video advertisements. JLT Jurnal Linguistik Terapan, 14(1), 27–37. https://jurnal.polinema.ac.id/index.php/jlt/article/view/4558</w:t>
       </w:r>
     </w:p>
     <w:p>
       <w:pPr>
         <w:spacing w:line="480" w:lineRule="auto" w:before="0" w:after="0"/>
-        <w:jc w:val="both"/>
+        <w:ind w:left="720" w:hanging="720"/>
+        <w:jc w:val="left"/>
       </w:pPr>
       <w:r>
         <w:rPr>
@@ -1007,13 +1011,14 @@
           <w:i w:val="0"/>
           <w:sz w:val="22"/>
         </w:rPr>
-        <w:t>Nasir, M., Akhtar, N., Jamil, M., &amp; Mazhar, M. (2025). Linguistic strategies through modes of persuasion: A textual analysis of Pakistani social media advertisements. Journal of Applied Linguistics and TESOL, 8(4).</w:t>
+        <w:t>Nasir, M., Akhtar, N., Jamil, M., &amp; Mazhar, M. (2025). Linguistic strategies through modes of persuasion: A textual analysis of Pakistani social media advertisements. Journal of Applied Linguistics and TESOL (JALT), 8(4), 937–951. https://doi.org/10.63878/jalt1428</w:t>
       </w:r>
     </w:p>
     <w:p>
       <w:pPr>
         <w:spacing w:line="480" w:lineRule="auto" w:before="0" w:after="0"/>
-        <w:jc w:val="both"/>
+        <w:ind w:left="720" w:hanging="720"/>
+        <w:jc w:val="left"/>
       </w:pPr>
       <w:r>
         <w:rPr>
@@ -1022,13 +1027,14 @@
           <w:i w:val="0"/>
           <w:sz w:val="22"/>
         </w:rPr>
-        <w:t>Pennock-Speck, B., &amp; Fuster-Márquez, M. (2014). Imperatives in voice-overs in British TV commercials: “Get this, buy that, taste the other.” Discourse &amp; Communication, 8(4). https://doi.org/10.1177/1750481314537578</w:t>
+        <w:t>Pennock-Speck, B., &amp; Fuster-Márquez, M. (2014). Imperatives in voice-overs in British TV commercials: “Get this, buy that, taste the other.” Discourse &amp; Communication, 8(4), 411–426. https://doi.org/10.1177/1750481314537578</w:t>
       </w:r>
     </w:p>
     <w:p>
       <w:pPr>
         <w:spacing w:line="480" w:lineRule="auto" w:before="0" w:after="0"/>
-        <w:jc w:val="both"/>
+        <w:ind w:left="720" w:hanging="720"/>
+        <w:jc w:val="left"/>
       </w:pPr>
       <w:r>
         <w:rPr>
@@ -1037,13 +1043,14 @@
           <w:i w:val="0"/>
           <w:sz w:val="22"/>
         </w:rPr>
-        <w:t>Saad, &amp; Ismael. (2025). [Rhetorical appeals and speech acts in cosmetic advertising, as cited in the thesis.]</w:t>
+        <w:t>Rapp, C. (2022). Aristotle’s rhetoric. In E. N. Zalta (Ed.), The Stanford Encyclopedia of Philosophy (Spring 2022 ed.). Stanford University. https://plato.stanford.edu/entries/aristotle-rhetoric/</w:t>
       </w:r>
     </w:p>
     <w:p>
       <w:pPr>
         <w:spacing w:line="480" w:lineRule="auto" w:before="0" w:after="0"/>
-        <w:jc w:val="both"/>
+        <w:ind w:left="720" w:hanging="720"/>
+        <w:jc w:val="left"/>
       </w:pPr>
       <w:r>
         <w:rPr>
@@ -1052,13 +1059,14 @@
           <w:i w:val="0"/>
           <w:sz w:val="22"/>
         </w:rPr>
-        <w:t>Searle, J. R. (1975/1976). Speech acts / A classification of illocutionary acts. [As cited in the thesis framework.]</w:t>
+        <w:t>Saad, I. T., &amp; Ismael, A. A. (2025). The art of selling beauty: Analyzing persuasive strategies and speech acts in social media cosmetics advertising. Tasnim International Journal for Human, Social and Legal Sciences, 14. https://doi.org/10.56924/tasnim.14.2025/23</w:t>
       </w:r>
     </w:p>
     <w:p>
       <w:pPr>
         <w:spacing w:line="480" w:lineRule="auto" w:before="0" w:after="0"/>
-        <w:jc w:val="both"/>
+        <w:ind w:left="720" w:hanging="720"/>
+        <w:jc w:val="left"/>
       </w:pPr>
       <w:r>
         <w:rPr>
@@ -1067,13 +1075,14 @@
           <w:i w:val="0"/>
           <w:sz w:val="22"/>
         </w:rPr>
-        <w:t>Stanford Encyclopedia of Philosophy. (2022). Aristotle’s rhetoric. [Ethos, pathos, logos definitions as cited in the thesis.]</w:t>
+        <w:t>Searle, J. R. (1975). Indirect speech acts. In P. Cole &amp; J. L. Morgan (Eds.), Syntax and semantics: Vol. 3. Speech acts (pp. 59–82). Academic Press.</w:t>
       </w:r>
     </w:p>
     <w:p>
       <w:pPr>
         <w:spacing w:line="480" w:lineRule="auto" w:before="0" w:after="0"/>
-        <w:jc w:val="both"/>
+        <w:ind w:left="720" w:hanging="720"/>
+        <w:jc w:val="left"/>
       </w:pPr>
       <w:r>
         <w:rPr>
@@ -1082,13 +1091,14 @@
           <w:i w:val="0"/>
           <w:sz w:val="22"/>
         </w:rPr>
-        <w:t>Talaue, (2022). [Aristotle’s rhetorical triangle in advertisements targeting college consumers, as cited in the thesis.]</w:t>
+        <w:t>Searle, J. R. (1976). A classification of illocutionary acts. Language in Society, 5(1), 1–23. https://doi.org/10.1017/S0047404500006837</w:t>
       </w:r>
     </w:p>
     <w:p>
       <w:pPr>
         <w:spacing w:line="480" w:lineRule="auto" w:before="0" w:after="0"/>
-        <w:jc w:val="both"/>
+        <w:ind w:left="720" w:hanging="720"/>
+        <w:jc w:val="left"/>
       </w:pPr>
       <w:r>
         <w:rPr>
@@ -1097,7 +1107,23 @@
           <w:i w:val="0"/>
           <w:sz w:val="22"/>
         </w:rPr>
-        <w:t>Yule, G. (1996). Pragmatics. Oxford University Press. [Directive subtypes as cited via Anggraini &amp; Afriana, 2023.]</w:t>
+        <w:t>Talaue, G. M. (2022). Aristotle’s rhetorical triangle as applied to advertisements: Its impact to Saudi Arabian college student consumers. International Journal of Applied Management Theory and Research, 4(1), 1–18. https://doi.org/10.4018/IJAMTR.300280</w:t>
+      </w:r>
+    </w:p>
+    <w:p>
+      <w:pPr>
+        <w:spacing w:line="480" w:lineRule="auto" w:before="0" w:after="0"/>
+        <w:ind w:left="720" w:hanging="720"/>
+        <w:jc w:val="left"/>
+      </w:pPr>
+      <w:r>
+        <w:rPr>
+          <w:rFonts w:ascii="Georgia" w:hAnsi="Georgia" w:eastAsia="Georgia"/>
+          <w:b w:val="0"/>
+          <w:i w:val="0"/>
+          <w:sz w:val="22"/>
+        </w:rPr>
+        <w:t>Yule, G. (1996). Pragmatics. Oxford University Press.</w:t>
       </w:r>
     </w:p>
     <w:sectPr>

</xml_diff>

<commit_message>
Velasquez Ch3: yellow-highlight revised body passages (not references)
</commit_message>
<xml_diff>
--- a/thesis/Velasquez/Chapter3_Results_Analysis_Discussion_Draft_001.docx
+++ b/thesis/Velasquez/Chapter3_Results_Analysis_Discussion_Draft_001.docx
@@ -30,6 +30,7 @@
           <w:b w:val="0"/>
           <w:i w:val="0"/>
           <w:sz w:val="22"/>
+          <w:highlight w:val="yellow"/>
         </w:rPr>
         <w:t>This chapter presents the results, analysis, and discussion of the rhetorical appeals and directive subtypes identified in the call-to-action (CTA) phrases of Facebook skincare advertisement captions. As an English Language Studies project, the chapter treats those findings as patterns in English use: how short commercial utterances encode persuasive appeals and perform directive acts. The chapter is organized into three parts, each corresponding to a research question. Part I presents the rhetorical appeals identified in the CTA phrases. Part II examines the directive subtypes present in the CTA phrases. Part III discusses how directive subtypes and rhetorical appeals contribute to the construction of persuasive meaning in the CTA phrases.</w:t>
       </w:r>
@@ -62,6 +63,7 @@
           <w:b w:val="0"/>
           <w:i w:val="0"/>
           <w:sz w:val="22"/>
+          <w:highlight w:val="yellow"/>
         </w:rPr>
         <w:t>The coding identified three rhetorical appeals across the 34 call-to-action (CTA) phrases from the selected Facebook skincare advertisement captions. These appeals were classified as logos, pathos, and ethos based on Aristotle’s rhetorical framework, in which logos appeals to reason, pathos to emotion, and ethos to credibility (Stanford Encyclopedia of Philosophy, 2022). In identifying the dominant rhetorical appeal, the full advertisement caption was examined for textual evidence, while the CTA phrase remained the primary unit of analysis. Table 1 presents the distribution of rhetorical appeals across the five selected skincare brands.</w:t>
       </w:r>
@@ -221,6 +223,7 @@
           <w:b w:val="0"/>
           <w:i w:val="0"/>
           <w:sz w:val="22"/>
+          <w:highlight w:val="yellow"/>
         </w:rPr>
         <w:t>A closer examination of logos across the five brands showed that The Ordinary had the highest frequency, with seven instances. Luxe Organix and Pond’s followed with five instances each, while Olay had three and Myra had two. The captions associated with these CTA phrases commonly presented product ingredients, features, numerical information, stated benefits, prices, and usage instructions. For example, Olay used “Get the power of 5 serum benefits in just one bottle!” where the number “5” and the reference to serum benefits provide specific product-related information. Luxe Organix captions likewise presented ingredients, sun protection, product functions, and prices. These elements supported classification under logos because they offer reasons for considering the product. That reading is consistent with logos as persuasion through logical reasoning or argument (Stanford Encyclopedia of Philosophy, 2022) and with digital-advertising analyses that locate logos in facts, specifications, and product data (Nasir et al., 2025).</w:t>
       </w:r>
@@ -237,6 +240,7 @@
           <w:b w:val="0"/>
           <w:i w:val="0"/>
           <w:sz w:val="22"/>
+          <w:highlight w:val="yellow"/>
         </w:rPr>
         <w:t>Pathos was identified in 11 CTA phrases. Olay and Myra had four instances each, followed by Luxe Organix with two and Pond’s with one. No CTA phrase from The Ordinary was classified under pathos. Captions in this group used expressions related to desirable skin conditions, emotional associations, promotional excitement, and urgency—for example Olay’s “Wrap your skin in love,” “glowy, refreshed skin,” and “Don’t miss out!”; Luxe Organix’s “Want to achieve a youthful skin?”; and Myra’s “Give her the gift of youthful radiance.” Such wording appeals to desire, care, and urgency. Beauty-advertising research often finds pathos realized through aspirational appearance and affective framing (Dwiyanti, 2024). In English terms, pathos here is carried by evaluative lexis (youthful, glow, radiance) and interpersonal frames (gift, love, miss out).</w:t>
       </w:r>
@@ -253,6 +257,7 @@
           <w:b w:val="0"/>
           <w:i w:val="0"/>
           <w:sz w:val="22"/>
+          <w:highlight w:val="yellow"/>
         </w:rPr>
         <w:t>Ethos was identified in only one CTA phrase, from Myra: “Myra’s trusted skincare essentials,” where trusted supplies an explicit credibility cue. By contrast, “made by Myra” in another advertisement was not treated as ethos merely because it named the brand; accompanying words such as Glow and Radiance supported a pathos reading instead. Classification therefore rested on textual evidence of trustworthiness, not on brand identification alone. That distinction follows the definition of ethos as an appeal based on credibility (Stanford Encyclopedia of Philosophy, 2022) and keeps the coding rule available for defense: form alone does not equal function.</w:t>
       </w:r>
@@ -269,6 +274,7 @@
           <w:b w:val="0"/>
           <w:i w:val="0"/>
           <w:sz w:val="22"/>
+          <w:highlight w:val="yellow"/>
         </w:rPr>
         <w:t>The findings can be compared with Dwiyanti (2024), who examined persuasive techniques in makeup and skincare video advertisements and found pathos most frequent, with logos and ethos less common. The present study found logos dominant. The difference is better read as a difference in material and unit of analysis—short CTA-centered Facebook captions versus multimodal video advertisements—than as a claim that the platform itself caused the shift. Philippine Facebook advertising work has also shown ethos and pathos operating strongly in other product sectors (De Castro &amp; Martinez, 2025; Talaue, 2022), which further suggests that rhetorical distribution tracks discourse type and coding focus as much as product category.</w:t>
       </w:r>
@@ -285,6 +291,7 @@
           <w:b w:val="0"/>
           <w:i w:val="0"/>
           <w:sz w:val="22"/>
+          <w:highlight w:val="yellow"/>
         </w:rPr>
         <w:t>Overall, logos, pathos, and ethos were all present in the selected captions. Logos was the most frequent appeal, followed by pathos and ethos. For English Language Studies, the main point is not market effectiveness but wording: in this corpus, persuasive English in skincare CTAs most often builds on product information and stated benefits, with emotional and credibility resources used more selectively.</w:t>
       </w:r>
@@ -380,6 +387,7 @@
           <w:b w:val="0"/>
           <w:i w:val="0"/>
           <w:sz w:val="22"/>
+          <w:highlight w:val="yellow"/>
         </w:rPr>
         <w:t>The coding identified two directive subtypes across the 34 CTA phrases: order and suggestion. Four subtypes were available in the framework—command, order, request, and suggestion—following Yule (1996) as operationalized by Anggraini and Afriana (2023). Directives, in Searle’s taxonomy, are illocutionary acts through which the speaker attempts to get the hearer to do something (Searle, 1975, 1976). Table 3 presents the distribution of directive subtypes across the five brands.</w:t>
       </w:r>
@@ -558,6 +566,7 @@
           <w:b w:val="0"/>
           <w:i w:val="0"/>
           <w:sz w:val="22"/>
+          <w:highlight w:val="yellow"/>
         </w:rPr>
         <w:t>Orders directed consumers toward concrete commercial actions: checking out products, shopping, choosing from a range, adding items to a cart, exploring a website, applying a product, or obtaining an item online. Examples include Olay’s “Shop now at Watsons, S&amp;R, Robinsons Department Store, Landmark Department Store, Shopee and Lazada” and The Ordinary’s “Discover now via theordinary.com.” These were classified as orders because they directly instruct the audience to perform a specific action. Advertising research on imperatives notes that commercial directives often take short, verb-led English forms and that their force may function more like instruction or recommendation than institutional command (Pennock-Speck &amp; Fuster-Márquez, 2014).</w:t>
       </w:r>
@@ -574,6 +583,7 @@
           <w:b w:val="0"/>
           <w:i w:val="0"/>
           <w:sz w:val="22"/>
+          <w:highlight w:val="yellow"/>
         </w:rPr>
         <w:t>Suggestion was identified in 12 CTA phrases, most often in Myra and Pond’s, with fewer cases in The Ordinary and Luxe Organix, and none in Olay. These expressions encouraged consumers to consider trying a product, incorporating it into a routine, or pursuing a desired result—for example Luxe Organix’s “Try this newest Niacinamide + Retinol cloudsoap!,” The Ordinary’s “Power Up Your P.M.,” and Myra’s “Give her the gift of youthful radiance with Myra Ultimate.” Under the operational definitions adopted from Anggraini and Afriana (2023), suggestion proposes a course of action while leaving the hearer room to accept or refuse it. The English of suggestion in this corpus often retains an imperative surface (Try, Give, Experience) but carries lower directive force than order.</w:t>
       </w:r>
@@ -590,6 +600,7 @@
           <w:b w:val="0"/>
           <w:i w:val="0"/>
           <w:sz w:val="22"/>
+          <w:highlight w:val="yellow"/>
         </w:rPr>
         <w:t>No instances of command or request met the operational criteria. Command, in the adopted framework, implies a stronger authority asymmetry; request implies a more polite ask. Commercial Facebook CTAs in this sample clustered instead on order and suggestion. That pattern is consistent with advertising English that prefers clear action prompts without the interpersonal softening typical of polite requests or the institutional force of true commands (Pennock-Speck &amp; Fuster-Márquez, 2014).</w:t>
       </w:r>
@@ -606,6 +617,7 @@
           <w:b w:val="0"/>
           <w:i w:val="0"/>
           <w:sz w:val="22"/>
+          <w:highlight w:val="yellow"/>
         </w:rPr>
         <w:t>Overall, order dominated and suggestion was secondary. For English Language Studies, the finding answers the second research question as a distribution of illocutionary subtypes in English CTA phrases: the selected advertisements mainly use direct instruction and, less often, recommended consideration. Command and request were available in the scheme but did not appear in the data.</w:t>
       </w:r>
@@ -882,6 +894,7 @@
           <w:b w:val="0"/>
           <w:i w:val="0"/>
           <w:sz w:val="22"/>
+          <w:highlight w:val="yellow"/>
         </w:rPr>
         <w:t>Logos + Order was the most frequent combination (15; 44.12%), followed by Logos + Suggestion (7; 20.59%), Pathos + Order (6; 17.65%), Pathos + Suggestion (5; 14.71%), and Ethos + Order (1; 2.94%). Studies that integrate rhetorical appeals with speech-act analysis in cosmetics and social-media advertising similarly treat persuasion as multi-layered: ads both argue and direct (Saad &amp; Ismael, 2025; related work on social-media cosmetics advertising). The present distribution specifies how that layering appears in English CTA phrases for five skincare brands on Facebook.</w:t>
       </w:r>
@@ -898,6 +911,7 @@
           <w:b w:val="0"/>
           <w:i w:val="0"/>
           <w:sz w:val="22"/>
+          <w:highlight w:val="yellow"/>
         </w:rPr>
         <w:t>Logos + Order, found in Olay, Luxe Organix, The Ordinary, and Pond’s, pairs product-related information with a direct instruction. English in this combination typically offers a product reason (ingredient, benefit, SPF, price) and simultaneously performs an order (Shop now, Apply, Discover). Logos supplies the informational basis; order directs the intended action. Logos + Suggestion, found in The Ordinary, Myra, and Pond’s, keeps the informational basis but softens the directive to an action the consumer may consider. Pathos + Order links desirable outcomes or affective frames with direct instruction, while Pathos + Suggestion links those frames with invited consideration. Ethos + Order appeared once in Myra, where explicit trust language accompanied a direct instruction. In each case, persuasive meaning is not appeal alone or directive alone; it is the English packaging of both in one CTA unit.</w:t>
       </w:r>
@@ -914,6 +928,7 @@
           <w:b w:val="0"/>
           <w:i w:val="0"/>
           <w:sz w:val="22"/>
+          <w:highlight w:val="yellow"/>
         </w:rPr>
         <w:t>Brand-level patterns refine the picture without changing the overall claim. Olay combined pathos or logos with order only. The Ordinary stayed within logos, paired with order or suggestion. Myra showed the widest mix, including the sole ethos case and a higher share of suggestion. Pond’s and Luxe Organix mixed logos- and pathos-based combinations. These are patterns of English choice in caption writing, not measures of campaign success.</w:t>
       </w:r>
@@ -930,6 +945,7 @@
           <w:b w:val="0"/>
           <w:i w:val="0"/>
           <w:sz w:val="22"/>
+          <w:highlight w:val="yellow"/>
         </w:rPr>
         <w:t>Overall, persuasive meaning in the selected Facebook skincare advertisements was constructed through the combination of rhetorical appeals and directive subtypes. Logos presented product-related information, pathos appealed to feelings and desired appearance, and ethos conveyed credibility when the wording supported it. Orders directed specific actions; suggestions invited consideration. As an English Language Studies analysis, the chapter accounts for how those resources are worded and what illocutionary work they do. It does not establish whether consumers purchased or used the products.</w:t>
       </w:r>

</xml_diff>

<commit_message>
Velasquez Ch3: proper Word tables for Tables 1, 3, 5
</commit_message>
<xml_diff>
--- a/thesis/Velasquez/Chapter3_Results_Analysis_Discussion_Draft_001.docx
+++ b/thesis/Velasquez/Chapter3_Results_Analysis_Discussion_Draft_001.docx
@@ -100,101 +100,437 @@
         <w:t>Frequency and Percentage Distribution of Rhetorical Appeals</w:t>
       </w:r>
     </w:p>
-    <w:p>
-      <w:pPr>
-        <w:spacing w:line="480" w:lineRule="auto" w:before="0" w:after="0"/>
-        <w:jc w:val="both"/>
-      </w:pPr>
-      <w:r>
-        <w:rPr>
-          <w:rFonts w:ascii="Georgia" w:hAnsi="Georgia" w:eastAsia="Georgia"/>
-          <w:b w:val="0"/>
-          <w:i w:val="0"/>
-          <w:sz w:val="22"/>
-        </w:rPr>
-        <w:t>Rhetorical Appeal</w:t>
-        <w:tab/>
-        <w:t>Frequency</w:t>
-        <w:tab/>
-        <w:t>Percentage</w:t>
-      </w:r>
-    </w:p>
-    <w:p>
-      <w:pPr>
-        <w:spacing w:line="480" w:lineRule="auto" w:before="0" w:after="0"/>
-        <w:jc w:val="both"/>
-      </w:pPr>
-      <w:r>
-        <w:rPr>
-          <w:rFonts w:ascii="Georgia" w:hAnsi="Georgia" w:eastAsia="Georgia"/>
-          <w:b w:val="0"/>
-          <w:i w:val="0"/>
-          <w:sz w:val="22"/>
-        </w:rPr>
-        <w:t>Logos</w:t>
-        <w:tab/>
-        <w:t>22</w:t>
-        <w:tab/>
-        <w:t>64.71%</w:t>
-      </w:r>
-    </w:p>
-    <w:p>
-      <w:pPr>
-        <w:spacing w:line="480" w:lineRule="auto" w:before="0" w:after="0"/>
-        <w:jc w:val="both"/>
-      </w:pPr>
-      <w:r>
-        <w:rPr>
-          <w:rFonts w:ascii="Georgia" w:hAnsi="Georgia" w:eastAsia="Georgia"/>
-          <w:b w:val="0"/>
-          <w:i w:val="0"/>
-          <w:sz w:val="22"/>
-        </w:rPr>
-        <w:t>Pathos</w:t>
-        <w:tab/>
-        <w:t>11</w:t>
-        <w:tab/>
-        <w:t>32.35%</w:t>
-      </w:r>
-    </w:p>
-    <w:p>
-      <w:pPr>
-        <w:spacing w:line="480" w:lineRule="auto" w:before="0" w:after="0"/>
-        <w:jc w:val="both"/>
-      </w:pPr>
-      <w:r>
-        <w:rPr>
-          <w:rFonts w:ascii="Georgia" w:hAnsi="Georgia" w:eastAsia="Georgia"/>
-          <w:b w:val="0"/>
-          <w:i w:val="0"/>
-          <w:sz w:val="22"/>
-        </w:rPr>
-        <w:t>Ethos</w:t>
-        <w:tab/>
-        <w:t>1</w:t>
-        <w:tab/>
-        <w:t>2.94%</w:t>
-      </w:r>
-    </w:p>
-    <w:p>
-      <w:pPr>
-        <w:spacing w:line="480" w:lineRule="auto" w:before="0" w:after="0"/>
-        <w:jc w:val="both"/>
-      </w:pPr>
-      <w:r>
-        <w:rPr>
-          <w:rFonts w:ascii="Georgia" w:hAnsi="Georgia" w:eastAsia="Georgia"/>
-          <w:b w:val="0"/>
-          <w:i w:val="0"/>
-          <w:sz w:val="22"/>
-        </w:rPr>
-        <w:t>Total</w:t>
-        <w:tab/>
-        <w:t>34</w:t>
-        <w:tab/>
-        <w:t>100%</w:t>
-      </w:r>
-    </w:p>
+    <w:tbl>
+      <w:tblPr>
+        <w:tblStyle w:val="TableGrid"/>
+        <w:tblW w:type="auto" w:w="0"/>
+        <w:jc w:val="center"/>
+        <w:tblLook w:firstColumn="1" w:firstRow="1" w:lastColumn="0" w:lastRow="0" w:noHBand="0" w:noVBand="1" w:val="04A0"/>
+      </w:tblPr>
+      <w:tblGrid>
+        <w:gridCol w:w="2880"/>
+        <w:gridCol w:w="2880"/>
+        <w:gridCol w:w="2880"/>
+      </w:tblGrid>
+      <w:tr>
+        <w:tc>
+          <w:tcPr>
+            <w:tcW w:type="dxa" w:w="3168"/>
+            <w:tcBorders>
+              <w:top w:val="single" w:sz="4" w:space="0" w:color="000000"/>
+              <w:left w:val="single" w:sz="4" w:space="0" w:color="000000"/>
+              <w:bottom w:val="single" w:sz="4" w:space="0" w:color="000000"/>
+              <w:right w:val="single" w:sz="4" w:space="0" w:color="000000"/>
+            </w:tcBorders>
+            <w:shd w:fill="D9D9D9" w:val="clear"/>
+          </w:tcPr>
+          <w:p>
+            <w:pPr>
+              <w:spacing w:before="40" w:after="40" w:line="240" w:lineRule="auto"/>
+              <w:jc w:val="center"/>
+            </w:pPr>
+            <w:r/>
+            <w:r>
+              <w:rPr>
+                <w:rFonts w:ascii="Georgia" w:hAnsi="Georgia" w:eastAsia="Georgia"/>
+                <w:b/>
+                <w:i w:val="0"/>
+                <w:sz w:val="18"/>
+              </w:rPr>
+              <w:t>Rhetorical Appeal</w:t>
+            </w:r>
+          </w:p>
+        </w:tc>
+        <w:tc>
+          <w:tcPr>
+            <w:tcW w:type="dxa" w:w="2160"/>
+            <w:tcBorders>
+              <w:top w:val="single" w:sz="4" w:space="0" w:color="000000"/>
+              <w:left w:val="single" w:sz="4" w:space="0" w:color="000000"/>
+              <w:bottom w:val="single" w:sz="4" w:space="0" w:color="000000"/>
+              <w:right w:val="single" w:sz="4" w:space="0" w:color="000000"/>
+            </w:tcBorders>
+            <w:shd w:fill="D9D9D9" w:val="clear"/>
+          </w:tcPr>
+          <w:p>
+            <w:pPr>
+              <w:spacing w:before="40" w:after="40" w:line="240" w:lineRule="auto"/>
+              <w:jc w:val="center"/>
+            </w:pPr>
+            <w:r/>
+            <w:r>
+              <w:rPr>
+                <w:rFonts w:ascii="Georgia" w:hAnsi="Georgia" w:eastAsia="Georgia"/>
+                <w:b/>
+                <w:i w:val="0"/>
+                <w:sz w:val="18"/>
+              </w:rPr>
+              <w:t>Frequency</w:t>
+            </w:r>
+          </w:p>
+        </w:tc>
+        <w:tc>
+          <w:tcPr>
+            <w:tcW w:type="dxa" w:w="2160"/>
+            <w:tcBorders>
+              <w:top w:val="single" w:sz="4" w:space="0" w:color="000000"/>
+              <w:left w:val="single" w:sz="4" w:space="0" w:color="000000"/>
+              <w:bottom w:val="single" w:sz="4" w:space="0" w:color="000000"/>
+              <w:right w:val="single" w:sz="4" w:space="0" w:color="000000"/>
+            </w:tcBorders>
+            <w:shd w:fill="D9D9D9" w:val="clear"/>
+          </w:tcPr>
+          <w:p>
+            <w:pPr>
+              <w:spacing w:before="40" w:after="40" w:line="240" w:lineRule="auto"/>
+              <w:jc w:val="center"/>
+            </w:pPr>
+            <w:r/>
+            <w:r>
+              <w:rPr>
+                <w:rFonts w:ascii="Georgia" w:hAnsi="Georgia" w:eastAsia="Georgia"/>
+                <w:b/>
+                <w:i w:val="0"/>
+                <w:sz w:val="18"/>
+              </w:rPr>
+              <w:t>Percentage</w:t>
+            </w:r>
+          </w:p>
+        </w:tc>
+      </w:tr>
+      <w:tr>
+        <w:tc>
+          <w:tcPr>
+            <w:tcW w:type="dxa" w:w="3168"/>
+            <w:tcBorders>
+              <w:top w:val="single" w:sz="4" w:space="0" w:color="000000"/>
+              <w:left w:val="single" w:sz="4" w:space="0" w:color="000000"/>
+              <w:bottom w:val="single" w:sz="4" w:space="0" w:color="000000"/>
+              <w:right w:val="single" w:sz="4" w:space="0" w:color="000000"/>
+            </w:tcBorders>
+          </w:tcPr>
+          <w:p>
+            <w:pPr>
+              <w:spacing w:before="40" w:after="40" w:line="240" w:lineRule="auto"/>
+              <w:jc w:val="center"/>
+            </w:pPr>
+            <w:r/>
+            <w:r>
+              <w:rPr>
+                <w:rFonts w:ascii="Georgia" w:hAnsi="Georgia" w:eastAsia="Georgia"/>
+                <w:b w:val="0"/>
+                <w:i w:val="0"/>
+                <w:sz w:val="18"/>
+              </w:rPr>
+              <w:t>Logos</w:t>
+            </w:r>
+          </w:p>
+        </w:tc>
+        <w:tc>
+          <w:tcPr>
+            <w:tcW w:type="dxa" w:w="2160"/>
+            <w:tcBorders>
+              <w:top w:val="single" w:sz="4" w:space="0" w:color="000000"/>
+              <w:left w:val="single" w:sz="4" w:space="0" w:color="000000"/>
+              <w:bottom w:val="single" w:sz="4" w:space="0" w:color="000000"/>
+              <w:right w:val="single" w:sz="4" w:space="0" w:color="000000"/>
+            </w:tcBorders>
+          </w:tcPr>
+          <w:p>
+            <w:pPr>
+              <w:spacing w:before="40" w:after="40" w:line="240" w:lineRule="auto"/>
+              <w:jc w:val="center"/>
+            </w:pPr>
+            <w:r/>
+            <w:r>
+              <w:rPr>
+                <w:rFonts w:ascii="Georgia" w:hAnsi="Georgia" w:eastAsia="Georgia"/>
+                <w:b w:val="0"/>
+                <w:i w:val="0"/>
+                <w:sz w:val="18"/>
+              </w:rPr>
+              <w:t>22</w:t>
+            </w:r>
+          </w:p>
+        </w:tc>
+        <w:tc>
+          <w:tcPr>
+            <w:tcW w:type="dxa" w:w="2160"/>
+            <w:tcBorders>
+              <w:top w:val="single" w:sz="4" w:space="0" w:color="000000"/>
+              <w:left w:val="single" w:sz="4" w:space="0" w:color="000000"/>
+              <w:bottom w:val="single" w:sz="4" w:space="0" w:color="000000"/>
+              <w:right w:val="single" w:sz="4" w:space="0" w:color="000000"/>
+            </w:tcBorders>
+          </w:tcPr>
+          <w:p>
+            <w:pPr>
+              <w:spacing w:before="40" w:after="40" w:line="240" w:lineRule="auto"/>
+              <w:jc w:val="center"/>
+            </w:pPr>
+            <w:r/>
+            <w:r>
+              <w:rPr>
+                <w:rFonts w:ascii="Georgia" w:hAnsi="Georgia" w:eastAsia="Georgia"/>
+                <w:b w:val="0"/>
+                <w:i w:val="0"/>
+                <w:sz w:val="18"/>
+              </w:rPr>
+              <w:t>64.71%</w:t>
+            </w:r>
+          </w:p>
+        </w:tc>
+      </w:tr>
+      <w:tr>
+        <w:tc>
+          <w:tcPr>
+            <w:tcW w:type="dxa" w:w="3168"/>
+            <w:tcBorders>
+              <w:top w:val="single" w:sz="4" w:space="0" w:color="000000"/>
+              <w:left w:val="single" w:sz="4" w:space="0" w:color="000000"/>
+              <w:bottom w:val="single" w:sz="4" w:space="0" w:color="000000"/>
+              <w:right w:val="single" w:sz="4" w:space="0" w:color="000000"/>
+            </w:tcBorders>
+          </w:tcPr>
+          <w:p>
+            <w:pPr>
+              <w:spacing w:before="40" w:after="40" w:line="240" w:lineRule="auto"/>
+              <w:jc w:val="center"/>
+            </w:pPr>
+            <w:r/>
+            <w:r>
+              <w:rPr>
+                <w:rFonts w:ascii="Georgia" w:hAnsi="Georgia" w:eastAsia="Georgia"/>
+                <w:b w:val="0"/>
+                <w:i w:val="0"/>
+                <w:sz w:val="18"/>
+              </w:rPr>
+              <w:t>Pathos</w:t>
+            </w:r>
+          </w:p>
+        </w:tc>
+        <w:tc>
+          <w:tcPr>
+            <w:tcW w:type="dxa" w:w="2160"/>
+            <w:tcBorders>
+              <w:top w:val="single" w:sz="4" w:space="0" w:color="000000"/>
+              <w:left w:val="single" w:sz="4" w:space="0" w:color="000000"/>
+              <w:bottom w:val="single" w:sz="4" w:space="0" w:color="000000"/>
+              <w:right w:val="single" w:sz="4" w:space="0" w:color="000000"/>
+            </w:tcBorders>
+          </w:tcPr>
+          <w:p>
+            <w:pPr>
+              <w:spacing w:before="40" w:after="40" w:line="240" w:lineRule="auto"/>
+              <w:jc w:val="center"/>
+            </w:pPr>
+            <w:r/>
+            <w:r>
+              <w:rPr>
+                <w:rFonts w:ascii="Georgia" w:hAnsi="Georgia" w:eastAsia="Georgia"/>
+                <w:b w:val="0"/>
+                <w:i w:val="0"/>
+                <w:sz w:val="18"/>
+              </w:rPr>
+              <w:t>11</w:t>
+            </w:r>
+          </w:p>
+        </w:tc>
+        <w:tc>
+          <w:tcPr>
+            <w:tcW w:type="dxa" w:w="2160"/>
+            <w:tcBorders>
+              <w:top w:val="single" w:sz="4" w:space="0" w:color="000000"/>
+              <w:left w:val="single" w:sz="4" w:space="0" w:color="000000"/>
+              <w:bottom w:val="single" w:sz="4" w:space="0" w:color="000000"/>
+              <w:right w:val="single" w:sz="4" w:space="0" w:color="000000"/>
+            </w:tcBorders>
+          </w:tcPr>
+          <w:p>
+            <w:pPr>
+              <w:spacing w:before="40" w:after="40" w:line="240" w:lineRule="auto"/>
+              <w:jc w:val="center"/>
+            </w:pPr>
+            <w:r/>
+            <w:r>
+              <w:rPr>
+                <w:rFonts w:ascii="Georgia" w:hAnsi="Georgia" w:eastAsia="Georgia"/>
+                <w:b w:val="0"/>
+                <w:i w:val="0"/>
+                <w:sz w:val="18"/>
+              </w:rPr>
+              <w:t>32.35%</w:t>
+            </w:r>
+          </w:p>
+        </w:tc>
+      </w:tr>
+      <w:tr>
+        <w:tc>
+          <w:tcPr>
+            <w:tcW w:type="dxa" w:w="3168"/>
+            <w:tcBorders>
+              <w:top w:val="single" w:sz="4" w:space="0" w:color="000000"/>
+              <w:left w:val="single" w:sz="4" w:space="0" w:color="000000"/>
+              <w:bottom w:val="single" w:sz="4" w:space="0" w:color="000000"/>
+              <w:right w:val="single" w:sz="4" w:space="0" w:color="000000"/>
+            </w:tcBorders>
+          </w:tcPr>
+          <w:p>
+            <w:pPr>
+              <w:spacing w:before="40" w:after="40" w:line="240" w:lineRule="auto"/>
+              <w:jc w:val="center"/>
+            </w:pPr>
+            <w:r/>
+            <w:r>
+              <w:rPr>
+                <w:rFonts w:ascii="Georgia" w:hAnsi="Georgia" w:eastAsia="Georgia"/>
+                <w:b w:val="0"/>
+                <w:i w:val="0"/>
+                <w:sz w:val="18"/>
+              </w:rPr>
+              <w:t>Ethos</w:t>
+            </w:r>
+          </w:p>
+        </w:tc>
+        <w:tc>
+          <w:tcPr>
+            <w:tcW w:type="dxa" w:w="2160"/>
+            <w:tcBorders>
+              <w:top w:val="single" w:sz="4" w:space="0" w:color="000000"/>
+              <w:left w:val="single" w:sz="4" w:space="0" w:color="000000"/>
+              <w:bottom w:val="single" w:sz="4" w:space="0" w:color="000000"/>
+              <w:right w:val="single" w:sz="4" w:space="0" w:color="000000"/>
+            </w:tcBorders>
+          </w:tcPr>
+          <w:p>
+            <w:pPr>
+              <w:spacing w:before="40" w:after="40" w:line="240" w:lineRule="auto"/>
+              <w:jc w:val="center"/>
+            </w:pPr>
+            <w:r/>
+            <w:r>
+              <w:rPr>
+                <w:rFonts w:ascii="Georgia" w:hAnsi="Georgia" w:eastAsia="Georgia"/>
+                <w:b w:val="0"/>
+                <w:i w:val="0"/>
+                <w:sz w:val="18"/>
+              </w:rPr>
+              <w:t>1</w:t>
+            </w:r>
+          </w:p>
+        </w:tc>
+        <w:tc>
+          <w:tcPr>
+            <w:tcW w:type="dxa" w:w="2160"/>
+            <w:tcBorders>
+              <w:top w:val="single" w:sz="4" w:space="0" w:color="000000"/>
+              <w:left w:val="single" w:sz="4" w:space="0" w:color="000000"/>
+              <w:bottom w:val="single" w:sz="4" w:space="0" w:color="000000"/>
+              <w:right w:val="single" w:sz="4" w:space="0" w:color="000000"/>
+            </w:tcBorders>
+          </w:tcPr>
+          <w:p>
+            <w:pPr>
+              <w:spacing w:before="40" w:after="40" w:line="240" w:lineRule="auto"/>
+              <w:jc w:val="center"/>
+            </w:pPr>
+            <w:r/>
+            <w:r>
+              <w:rPr>
+                <w:rFonts w:ascii="Georgia" w:hAnsi="Georgia" w:eastAsia="Georgia"/>
+                <w:b w:val="0"/>
+                <w:i w:val="0"/>
+                <w:sz w:val="18"/>
+              </w:rPr>
+              <w:t>2.94%</w:t>
+            </w:r>
+          </w:p>
+        </w:tc>
+      </w:tr>
+      <w:tr>
+        <w:tc>
+          <w:tcPr>
+            <w:tcW w:type="dxa" w:w="3168"/>
+            <w:tcBorders>
+              <w:top w:val="single" w:sz="4" w:space="0" w:color="000000"/>
+              <w:left w:val="single" w:sz="4" w:space="0" w:color="000000"/>
+              <w:bottom w:val="single" w:sz="4" w:space="0" w:color="000000"/>
+              <w:right w:val="single" w:sz="4" w:space="0" w:color="000000"/>
+            </w:tcBorders>
+          </w:tcPr>
+          <w:p>
+            <w:pPr>
+              <w:spacing w:before="40" w:after="40" w:line="240" w:lineRule="auto"/>
+              <w:jc w:val="center"/>
+            </w:pPr>
+            <w:r/>
+            <w:r>
+              <w:rPr>
+                <w:rFonts w:ascii="Georgia" w:hAnsi="Georgia" w:eastAsia="Georgia"/>
+                <w:b/>
+                <w:i w:val="0"/>
+                <w:sz w:val="18"/>
+              </w:rPr>
+              <w:t>Total</w:t>
+            </w:r>
+          </w:p>
+        </w:tc>
+        <w:tc>
+          <w:tcPr>
+            <w:tcW w:type="dxa" w:w="2160"/>
+            <w:tcBorders>
+              <w:top w:val="single" w:sz="4" w:space="0" w:color="000000"/>
+              <w:left w:val="single" w:sz="4" w:space="0" w:color="000000"/>
+              <w:bottom w:val="single" w:sz="4" w:space="0" w:color="000000"/>
+              <w:right w:val="single" w:sz="4" w:space="0" w:color="000000"/>
+            </w:tcBorders>
+          </w:tcPr>
+          <w:p>
+            <w:pPr>
+              <w:spacing w:before="40" w:after="40" w:line="240" w:lineRule="auto"/>
+              <w:jc w:val="center"/>
+            </w:pPr>
+            <w:r/>
+            <w:r>
+              <w:rPr>
+                <w:rFonts w:ascii="Georgia" w:hAnsi="Georgia" w:eastAsia="Georgia"/>
+                <w:b/>
+                <w:i w:val="0"/>
+                <w:sz w:val="18"/>
+              </w:rPr>
+              <w:t>34</w:t>
+            </w:r>
+          </w:p>
+        </w:tc>
+        <w:tc>
+          <w:tcPr>
+            <w:tcW w:type="dxa" w:w="2160"/>
+            <w:tcBorders>
+              <w:top w:val="single" w:sz="4" w:space="0" w:color="000000"/>
+              <w:left w:val="single" w:sz="4" w:space="0" w:color="000000"/>
+              <w:bottom w:val="single" w:sz="4" w:space="0" w:color="000000"/>
+              <w:right w:val="single" w:sz="4" w:space="0" w:color="000000"/>
+            </w:tcBorders>
+          </w:tcPr>
+          <w:p>
+            <w:pPr>
+              <w:spacing w:before="40" w:after="40" w:line="240" w:lineRule="auto"/>
+              <w:jc w:val="center"/>
+            </w:pPr>
+            <w:r/>
+            <w:r>
+              <w:rPr>
+                <w:rFonts w:ascii="Georgia" w:hAnsi="Georgia" w:eastAsia="Georgia"/>
+                <w:b/>
+                <w:i w:val="0"/>
+                <w:sz w:val="18"/>
+              </w:rPr>
+              <w:t>100%</w:t>
+            </w:r>
+          </w:p>
+        </w:tc>
+      </w:tr>
+    </w:tbl>
     <w:p>
       <w:pPr>
         <w:spacing w:line="480" w:lineRule="auto" w:before="0" w:after="0"/>
@@ -424,120 +760,520 @@
         <w:t>Frequency and Percentage Distribution of Directive Subtypes</w:t>
       </w:r>
     </w:p>
-    <w:p>
-      <w:pPr>
-        <w:spacing w:line="480" w:lineRule="auto" w:before="0" w:after="0"/>
-        <w:jc w:val="both"/>
-      </w:pPr>
-      <w:r>
-        <w:rPr>
-          <w:rFonts w:ascii="Georgia" w:hAnsi="Georgia" w:eastAsia="Georgia"/>
-          <w:b w:val="0"/>
-          <w:i w:val="0"/>
-          <w:sz w:val="22"/>
-        </w:rPr>
-        <w:t>Directive Subtype</w:t>
-        <w:tab/>
-        <w:t>Frequency</w:t>
-        <w:tab/>
-        <w:t>Percentage</w:t>
-      </w:r>
-    </w:p>
-    <w:p>
-      <w:pPr>
-        <w:spacing w:line="480" w:lineRule="auto" w:before="0" w:after="0"/>
-        <w:jc w:val="both"/>
-      </w:pPr>
-      <w:r>
-        <w:rPr>
-          <w:rFonts w:ascii="Georgia" w:hAnsi="Georgia" w:eastAsia="Georgia"/>
-          <w:b w:val="0"/>
-          <w:i w:val="0"/>
-          <w:sz w:val="22"/>
-        </w:rPr>
-        <w:t>Command</w:t>
-        <w:tab/>
-        <w:t>0</w:t>
-        <w:tab/>
-        <w:t>0%</w:t>
-      </w:r>
-    </w:p>
-    <w:p>
-      <w:pPr>
-        <w:spacing w:line="480" w:lineRule="auto" w:before="0" w:after="0"/>
-        <w:jc w:val="both"/>
-      </w:pPr>
-      <w:r>
-        <w:rPr>
-          <w:rFonts w:ascii="Georgia" w:hAnsi="Georgia" w:eastAsia="Georgia"/>
-          <w:b w:val="0"/>
-          <w:i w:val="0"/>
-          <w:sz w:val="22"/>
-        </w:rPr>
-        <w:t>Order</w:t>
-        <w:tab/>
-        <w:t>22</w:t>
-        <w:tab/>
-        <w:t>64.71%</w:t>
-      </w:r>
-    </w:p>
-    <w:p>
-      <w:pPr>
-        <w:spacing w:line="480" w:lineRule="auto" w:before="0" w:after="0"/>
-        <w:jc w:val="both"/>
-      </w:pPr>
-      <w:r>
-        <w:rPr>
-          <w:rFonts w:ascii="Georgia" w:hAnsi="Georgia" w:eastAsia="Georgia"/>
-          <w:b w:val="0"/>
-          <w:i w:val="0"/>
-          <w:sz w:val="22"/>
-        </w:rPr>
-        <w:t>Suggestion</w:t>
-        <w:tab/>
-        <w:t>12</w:t>
-        <w:tab/>
-        <w:t>35.29%</w:t>
-      </w:r>
-    </w:p>
-    <w:p>
-      <w:pPr>
-        <w:spacing w:line="480" w:lineRule="auto" w:before="0" w:after="0"/>
-        <w:jc w:val="both"/>
-      </w:pPr>
-      <w:r>
-        <w:rPr>
-          <w:rFonts w:ascii="Georgia" w:hAnsi="Georgia" w:eastAsia="Georgia"/>
-          <w:b w:val="0"/>
-          <w:i w:val="0"/>
-          <w:sz w:val="22"/>
-        </w:rPr>
-        <w:t>Request</w:t>
-        <w:tab/>
-        <w:t>0</w:t>
-        <w:tab/>
-        <w:t>0%</w:t>
-      </w:r>
-    </w:p>
-    <w:p>
-      <w:pPr>
-        <w:spacing w:line="480" w:lineRule="auto" w:before="0" w:after="0"/>
-        <w:jc w:val="both"/>
-      </w:pPr>
-      <w:r>
-        <w:rPr>
-          <w:rFonts w:ascii="Georgia" w:hAnsi="Georgia" w:eastAsia="Georgia"/>
-          <w:b w:val="0"/>
-          <w:i w:val="0"/>
-          <w:sz w:val="22"/>
-        </w:rPr>
-        <w:t>Total</w:t>
-        <w:tab/>
-        <w:t>34</w:t>
-        <w:tab/>
-        <w:t>100%</w:t>
-      </w:r>
-    </w:p>
+    <w:tbl>
+      <w:tblPr>
+        <w:tblStyle w:val="TableGrid"/>
+        <w:tblW w:type="auto" w:w="0"/>
+        <w:jc w:val="center"/>
+        <w:tblLook w:firstColumn="1" w:firstRow="1" w:lastColumn="0" w:lastRow="0" w:noHBand="0" w:noVBand="1" w:val="04A0"/>
+      </w:tblPr>
+      <w:tblGrid>
+        <w:gridCol w:w="2880"/>
+        <w:gridCol w:w="2880"/>
+        <w:gridCol w:w="2880"/>
+      </w:tblGrid>
+      <w:tr>
+        <w:tc>
+          <w:tcPr>
+            <w:tcW w:type="dxa" w:w="3168"/>
+            <w:tcBorders>
+              <w:top w:val="single" w:sz="4" w:space="0" w:color="000000"/>
+              <w:left w:val="single" w:sz="4" w:space="0" w:color="000000"/>
+              <w:bottom w:val="single" w:sz="4" w:space="0" w:color="000000"/>
+              <w:right w:val="single" w:sz="4" w:space="0" w:color="000000"/>
+            </w:tcBorders>
+            <w:shd w:fill="D9D9D9" w:val="clear"/>
+          </w:tcPr>
+          <w:p>
+            <w:pPr>
+              <w:spacing w:before="40" w:after="40" w:line="240" w:lineRule="auto"/>
+              <w:jc w:val="center"/>
+            </w:pPr>
+            <w:r/>
+            <w:r>
+              <w:rPr>
+                <w:rFonts w:ascii="Georgia" w:hAnsi="Georgia" w:eastAsia="Georgia"/>
+                <w:b/>
+                <w:i w:val="0"/>
+                <w:sz w:val="18"/>
+              </w:rPr>
+              <w:t>Directive Subtype</w:t>
+            </w:r>
+          </w:p>
+        </w:tc>
+        <w:tc>
+          <w:tcPr>
+            <w:tcW w:type="dxa" w:w="2160"/>
+            <w:tcBorders>
+              <w:top w:val="single" w:sz="4" w:space="0" w:color="000000"/>
+              <w:left w:val="single" w:sz="4" w:space="0" w:color="000000"/>
+              <w:bottom w:val="single" w:sz="4" w:space="0" w:color="000000"/>
+              <w:right w:val="single" w:sz="4" w:space="0" w:color="000000"/>
+            </w:tcBorders>
+            <w:shd w:fill="D9D9D9" w:val="clear"/>
+          </w:tcPr>
+          <w:p>
+            <w:pPr>
+              <w:spacing w:before="40" w:after="40" w:line="240" w:lineRule="auto"/>
+              <w:jc w:val="center"/>
+            </w:pPr>
+            <w:r/>
+            <w:r>
+              <w:rPr>
+                <w:rFonts w:ascii="Georgia" w:hAnsi="Georgia" w:eastAsia="Georgia"/>
+                <w:b/>
+                <w:i w:val="0"/>
+                <w:sz w:val="18"/>
+              </w:rPr>
+              <w:t>Frequency</w:t>
+            </w:r>
+          </w:p>
+        </w:tc>
+        <w:tc>
+          <w:tcPr>
+            <w:tcW w:type="dxa" w:w="2160"/>
+            <w:tcBorders>
+              <w:top w:val="single" w:sz="4" w:space="0" w:color="000000"/>
+              <w:left w:val="single" w:sz="4" w:space="0" w:color="000000"/>
+              <w:bottom w:val="single" w:sz="4" w:space="0" w:color="000000"/>
+              <w:right w:val="single" w:sz="4" w:space="0" w:color="000000"/>
+            </w:tcBorders>
+            <w:shd w:fill="D9D9D9" w:val="clear"/>
+          </w:tcPr>
+          <w:p>
+            <w:pPr>
+              <w:spacing w:before="40" w:after="40" w:line="240" w:lineRule="auto"/>
+              <w:jc w:val="center"/>
+            </w:pPr>
+            <w:r/>
+            <w:r>
+              <w:rPr>
+                <w:rFonts w:ascii="Georgia" w:hAnsi="Georgia" w:eastAsia="Georgia"/>
+                <w:b/>
+                <w:i w:val="0"/>
+                <w:sz w:val="18"/>
+              </w:rPr>
+              <w:t>Percentage</w:t>
+            </w:r>
+          </w:p>
+        </w:tc>
+      </w:tr>
+      <w:tr>
+        <w:tc>
+          <w:tcPr>
+            <w:tcW w:type="dxa" w:w="3168"/>
+            <w:tcBorders>
+              <w:top w:val="single" w:sz="4" w:space="0" w:color="000000"/>
+              <w:left w:val="single" w:sz="4" w:space="0" w:color="000000"/>
+              <w:bottom w:val="single" w:sz="4" w:space="0" w:color="000000"/>
+              <w:right w:val="single" w:sz="4" w:space="0" w:color="000000"/>
+            </w:tcBorders>
+          </w:tcPr>
+          <w:p>
+            <w:pPr>
+              <w:spacing w:before="40" w:after="40" w:line="240" w:lineRule="auto"/>
+              <w:jc w:val="center"/>
+            </w:pPr>
+            <w:r/>
+            <w:r>
+              <w:rPr>
+                <w:rFonts w:ascii="Georgia" w:hAnsi="Georgia" w:eastAsia="Georgia"/>
+                <w:b w:val="0"/>
+                <w:i w:val="0"/>
+                <w:sz w:val="18"/>
+              </w:rPr>
+              <w:t>Command</w:t>
+            </w:r>
+          </w:p>
+        </w:tc>
+        <w:tc>
+          <w:tcPr>
+            <w:tcW w:type="dxa" w:w="2160"/>
+            <w:tcBorders>
+              <w:top w:val="single" w:sz="4" w:space="0" w:color="000000"/>
+              <w:left w:val="single" w:sz="4" w:space="0" w:color="000000"/>
+              <w:bottom w:val="single" w:sz="4" w:space="0" w:color="000000"/>
+              <w:right w:val="single" w:sz="4" w:space="0" w:color="000000"/>
+            </w:tcBorders>
+          </w:tcPr>
+          <w:p>
+            <w:pPr>
+              <w:spacing w:before="40" w:after="40" w:line="240" w:lineRule="auto"/>
+              <w:jc w:val="center"/>
+            </w:pPr>
+            <w:r/>
+            <w:r>
+              <w:rPr>
+                <w:rFonts w:ascii="Georgia" w:hAnsi="Georgia" w:eastAsia="Georgia"/>
+                <w:b w:val="0"/>
+                <w:i w:val="0"/>
+                <w:sz w:val="18"/>
+              </w:rPr>
+              <w:t>0</w:t>
+            </w:r>
+          </w:p>
+        </w:tc>
+        <w:tc>
+          <w:tcPr>
+            <w:tcW w:type="dxa" w:w="2160"/>
+            <w:tcBorders>
+              <w:top w:val="single" w:sz="4" w:space="0" w:color="000000"/>
+              <w:left w:val="single" w:sz="4" w:space="0" w:color="000000"/>
+              <w:bottom w:val="single" w:sz="4" w:space="0" w:color="000000"/>
+              <w:right w:val="single" w:sz="4" w:space="0" w:color="000000"/>
+            </w:tcBorders>
+          </w:tcPr>
+          <w:p>
+            <w:pPr>
+              <w:spacing w:before="40" w:after="40" w:line="240" w:lineRule="auto"/>
+              <w:jc w:val="center"/>
+            </w:pPr>
+            <w:r/>
+            <w:r>
+              <w:rPr>
+                <w:rFonts w:ascii="Georgia" w:hAnsi="Georgia" w:eastAsia="Georgia"/>
+                <w:b w:val="0"/>
+                <w:i w:val="0"/>
+                <w:sz w:val="18"/>
+              </w:rPr>
+              <w:t>0%</w:t>
+            </w:r>
+          </w:p>
+        </w:tc>
+      </w:tr>
+      <w:tr>
+        <w:tc>
+          <w:tcPr>
+            <w:tcW w:type="dxa" w:w="3168"/>
+            <w:tcBorders>
+              <w:top w:val="single" w:sz="4" w:space="0" w:color="000000"/>
+              <w:left w:val="single" w:sz="4" w:space="0" w:color="000000"/>
+              <w:bottom w:val="single" w:sz="4" w:space="0" w:color="000000"/>
+              <w:right w:val="single" w:sz="4" w:space="0" w:color="000000"/>
+            </w:tcBorders>
+          </w:tcPr>
+          <w:p>
+            <w:pPr>
+              <w:spacing w:before="40" w:after="40" w:line="240" w:lineRule="auto"/>
+              <w:jc w:val="center"/>
+            </w:pPr>
+            <w:r/>
+            <w:r>
+              <w:rPr>
+                <w:rFonts w:ascii="Georgia" w:hAnsi="Georgia" w:eastAsia="Georgia"/>
+                <w:b w:val="0"/>
+                <w:i w:val="0"/>
+                <w:sz w:val="18"/>
+              </w:rPr>
+              <w:t>Order</w:t>
+            </w:r>
+          </w:p>
+        </w:tc>
+        <w:tc>
+          <w:tcPr>
+            <w:tcW w:type="dxa" w:w="2160"/>
+            <w:tcBorders>
+              <w:top w:val="single" w:sz="4" w:space="0" w:color="000000"/>
+              <w:left w:val="single" w:sz="4" w:space="0" w:color="000000"/>
+              <w:bottom w:val="single" w:sz="4" w:space="0" w:color="000000"/>
+              <w:right w:val="single" w:sz="4" w:space="0" w:color="000000"/>
+            </w:tcBorders>
+          </w:tcPr>
+          <w:p>
+            <w:pPr>
+              <w:spacing w:before="40" w:after="40" w:line="240" w:lineRule="auto"/>
+              <w:jc w:val="center"/>
+            </w:pPr>
+            <w:r/>
+            <w:r>
+              <w:rPr>
+                <w:rFonts w:ascii="Georgia" w:hAnsi="Georgia" w:eastAsia="Georgia"/>
+                <w:b w:val="0"/>
+                <w:i w:val="0"/>
+                <w:sz w:val="18"/>
+              </w:rPr>
+              <w:t>22</w:t>
+            </w:r>
+          </w:p>
+        </w:tc>
+        <w:tc>
+          <w:tcPr>
+            <w:tcW w:type="dxa" w:w="2160"/>
+            <w:tcBorders>
+              <w:top w:val="single" w:sz="4" w:space="0" w:color="000000"/>
+              <w:left w:val="single" w:sz="4" w:space="0" w:color="000000"/>
+              <w:bottom w:val="single" w:sz="4" w:space="0" w:color="000000"/>
+              <w:right w:val="single" w:sz="4" w:space="0" w:color="000000"/>
+            </w:tcBorders>
+          </w:tcPr>
+          <w:p>
+            <w:pPr>
+              <w:spacing w:before="40" w:after="40" w:line="240" w:lineRule="auto"/>
+              <w:jc w:val="center"/>
+            </w:pPr>
+            <w:r/>
+            <w:r>
+              <w:rPr>
+                <w:rFonts w:ascii="Georgia" w:hAnsi="Georgia" w:eastAsia="Georgia"/>
+                <w:b w:val="0"/>
+                <w:i w:val="0"/>
+                <w:sz w:val="18"/>
+              </w:rPr>
+              <w:t>64.71%</w:t>
+            </w:r>
+          </w:p>
+        </w:tc>
+      </w:tr>
+      <w:tr>
+        <w:tc>
+          <w:tcPr>
+            <w:tcW w:type="dxa" w:w="3168"/>
+            <w:tcBorders>
+              <w:top w:val="single" w:sz="4" w:space="0" w:color="000000"/>
+              <w:left w:val="single" w:sz="4" w:space="0" w:color="000000"/>
+              <w:bottom w:val="single" w:sz="4" w:space="0" w:color="000000"/>
+              <w:right w:val="single" w:sz="4" w:space="0" w:color="000000"/>
+            </w:tcBorders>
+          </w:tcPr>
+          <w:p>
+            <w:pPr>
+              <w:spacing w:before="40" w:after="40" w:line="240" w:lineRule="auto"/>
+              <w:jc w:val="center"/>
+            </w:pPr>
+            <w:r/>
+            <w:r>
+              <w:rPr>
+                <w:rFonts w:ascii="Georgia" w:hAnsi="Georgia" w:eastAsia="Georgia"/>
+                <w:b w:val="0"/>
+                <w:i w:val="0"/>
+                <w:sz w:val="18"/>
+              </w:rPr>
+              <w:t>Suggestion</w:t>
+            </w:r>
+          </w:p>
+        </w:tc>
+        <w:tc>
+          <w:tcPr>
+            <w:tcW w:type="dxa" w:w="2160"/>
+            <w:tcBorders>
+              <w:top w:val="single" w:sz="4" w:space="0" w:color="000000"/>
+              <w:left w:val="single" w:sz="4" w:space="0" w:color="000000"/>
+              <w:bottom w:val="single" w:sz="4" w:space="0" w:color="000000"/>
+              <w:right w:val="single" w:sz="4" w:space="0" w:color="000000"/>
+            </w:tcBorders>
+          </w:tcPr>
+          <w:p>
+            <w:pPr>
+              <w:spacing w:before="40" w:after="40" w:line="240" w:lineRule="auto"/>
+              <w:jc w:val="center"/>
+            </w:pPr>
+            <w:r/>
+            <w:r>
+              <w:rPr>
+                <w:rFonts w:ascii="Georgia" w:hAnsi="Georgia" w:eastAsia="Georgia"/>
+                <w:b w:val="0"/>
+                <w:i w:val="0"/>
+                <w:sz w:val="18"/>
+              </w:rPr>
+              <w:t>12</w:t>
+            </w:r>
+          </w:p>
+        </w:tc>
+        <w:tc>
+          <w:tcPr>
+            <w:tcW w:type="dxa" w:w="2160"/>
+            <w:tcBorders>
+              <w:top w:val="single" w:sz="4" w:space="0" w:color="000000"/>
+              <w:left w:val="single" w:sz="4" w:space="0" w:color="000000"/>
+              <w:bottom w:val="single" w:sz="4" w:space="0" w:color="000000"/>
+              <w:right w:val="single" w:sz="4" w:space="0" w:color="000000"/>
+            </w:tcBorders>
+          </w:tcPr>
+          <w:p>
+            <w:pPr>
+              <w:spacing w:before="40" w:after="40" w:line="240" w:lineRule="auto"/>
+              <w:jc w:val="center"/>
+            </w:pPr>
+            <w:r/>
+            <w:r>
+              <w:rPr>
+                <w:rFonts w:ascii="Georgia" w:hAnsi="Georgia" w:eastAsia="Georgia"/>
+                <w:b w:val="0"/>
+                <w:i w:val="0"/>
+                <w:sz w:val="18"/>
+              </w:rPr>
+              <w:t>35.29%</w:t>
+            </w:r>
+          </w:p>
+        </w:tc>
+      </w:tr>
+      <w:tr>
+        <w:tc>
+          <w:tcPr>
+            <w:tcW w:type="dxa" w:w="3168"/>
+            <w:tcBorders>
+              <w:top w:val="single" w:sz="4" w:space="0" w:color="000000"/>
+              <w:left w:val="single" w:sz="4" w:space="0" w:color="000000"/>
+              <w:bottom w:val="single" w:sz="4" w:space="0" w:color="000000"/>
+              <w:right w:val="single" w:sz="4" w:space="0" w:color="000000"/>
+            </w:tcBorders>
+          </w:tcPr>
+          <w:p>
+            <w:pPr>
+              <w:spacing w:before="40" w:after="40" w:line="240" w:lineRule="auto"/>
+              <w:jc w:val="center"/>
+            </w:pPr>
+            <w:r/>
+            <w:r>
+              <w:rPr>
+                <w:rFonts w:ascii="Georgia" w:hAnsi="Georgia" w:eastAsia="Georgia"/>
+                <w:b w:val="0"/>
+                <w:i w:val="0"/>
+                <w:sz w:val="18"/>
+              </w:rPr>
+              <w:t>Request</w:t>
+            </w:r>
+          </w:p>
+        </w:tc>
+        <w:tc>
+          <w:tcPr>
+            <w:tcW w:type="dxa" w:w="2160"/>
+            <w:tcBorders>
+              <w:top w:val="single" w:sz="4" w:space="0" w:color="000000"/>
+              <w:left w:val="single" w:sz="4" w:space="0" w:color="000000"/>
+              <w:bottom w:val="single" w:sz="4" w:space="0" w:color="000000"/>
+              <w:right w:val="single" w:sz="4" w:space="0" w:color="000000"/>
+            </w:tcBorders>
+          </w:tcPr>
+          <w:p>
+            <w:pPr>
+              <w:spacing w:before="40" w:after="40" w:line="240" w:lineRule="auto"/>
+              <w:jc w:val="center"/>
+            </w:pPr>
+            <w:r/>
+            <w:r>
+              <w:rPr>
+                <w:rFonts w:ascii="Georgia" w:hAnsi="Georgia" w:eastAsia="Georgia"/>
+                <w:b w:val="0"/>
+                <w:i w:val="0"/>
+                <w:sz w:val="18"/>
+              </w:rPr>
+              <w:t>0</w:t>
+            </w:r>
+          </w:p>
+        </w:tc>
+        <w:tc>
+          <w:tcPr>
+            <w:tcW w:type="dxa" w:w="2160"/>
+            <w:tcBorders>
+              <w:top w:val="single" w:sz="4" w:space="0" w:color="000000"/>
+              <w:left w:val="single" w:sz="4" w:space="0" w:color="000000"/>
+              <w:bottom w:val="single" w:sz="4" w:space="0" w:color="000000"/>
+              <w:right w:val="single" w:sz="4" w:space="0" w:color="000000"/>
+            </w:tcBorders>
+          </w:tcPr>
+          <w:p>
+            <w:pPr>
+              <w:spacing w:before="40" w:after="40" w:line="240" w:lineRule="auto"/>
+              <w:jc w:val="center"/>
+            </w:pPr>
+            <w:r/>
+            <w:r>
+              <w:rPr>
+                <w:rFonts w:ascii="Georgia" w:hAnsi="Georgia" w:eastAsia="Georgia"/>
+                <w:b w:val="0"/>
+                <w:i w:val="0"/>
+                <w:sz w:val="18"/>
+              </w:rPr>
+              <w:t>0%</w:t>
+            </w:r>
+          </w:p>
+        </w:tc>
+      </w:tr>
+      <w:tr>
+        <w:tc>
+          <w:tcPr>
+            <w:tcW w:type="dxa" w:w="3168"/>
+            <w:tcBorders>
+              <w:top w:val="single" w:sz="4" w:space="0" w:color="000000"/>
+              <w:left w:val="single" w:sz="4" w:space="0" w:color="000000"/>
+              <w:bottom w:val="single" w:sz="4" w:space="0" w:color="000000"/>
+              <w:right w:val="single" w:sz="4" w:space="0" w:color="000000"/>
+            </w:tcBorders>
+          </w:tcPr>
+          <w:p>
+            <w:pPr>
+              <w:spacing w:before="40" w:after="40" w:line="240" w:lineRule="auto"/>
+              <w:jc w:val="center"/>
+            </w:pPr>
+            <w:r/>
+            <w:r>
+              <w:rPr>
+                <w:rFonts w:ascii="Georgia" w:hAnsi="Georgia" w:eastAsia="Georgia"/>
+                <w:b/>
+                <w:i w:val="0"/>
+                <w:sz w:val="18"/>
+              </w:rPr>
+              <w:t>Total</w:t>
+            </w:r>
+          </w:p>
+        </w:tc>
+        <w:tc>
+          <w:tcPr>
+            <w:tcW w:type="dxa" w:w="2160"/>
+            <w:tcBorders>
+              <w:top w:val="single" w:sz="4" w:space="0" w:color="000000"/>
+              <w:left w:val="single" w:sz="4" w:space="0" w:color="000000"/>
+              <w:bottom w:val="single" w:sz="4" w:space="0" w:color="000000"/>
+              <w:right w:val="single" w:sz="4" w:space="0" w:color="000000"/>
+            </w:tcBorders>
+          </w:tcPr>
+          <w:p>
+            <w:pPr>
+              <w:spacing w:before="40" w:after="40" w:line="240" w:lineRule="auto"/>
+              <w:jc w:val="center"/>
+            </w:pPr>
+            <w:r/>
+            <w:r>
+              <w:rPr>
+                <w:rFonts w:ascii="Georgia" w:hAnsi="Georgia" w:eastAsia="Georgia"/>
+                <w:b/>
+                <w:i w:val="0"/>
+                <w:sz w:val="18"/>
+              </w:rPr>
+              <w:t>34</w:t>
+            </w:r>
+          </w:p>
+        </w:tc>
+        <w:tc>
+          <w:tcPr>
+            <w:tcW w:type="dxa" w:w="2160"/>
+            <w:tcBorders>
+              <w:top w:val="single" w:sz="4" w:space="0" w:color="000000"/>
+              <w:left w:val="single" w:sz="4" w:space="0" w:color="000000"/>
+              <w:bottom w:val="single" w:sz="4" w:space="0" w:color="000000"/>
+              <w:right w:val="single" w:sz="4" w:space="0" w:color="000000"/>
+            </w:tcBorders>
+          </w:tcPr>
+          <w:p>
+            <w:pPr>
+              <w:spacing w:before="40" w:after="40" w:line="240" w:lineRule="auto"/>
+              <w:jc w:val="center"/>
+            </w:pPr>
+            <w:r/>
+            <w:r>
+              <w:rPr>
+                <w:rFonts w:ascii="Georgia" w:hAnsi="Georgia" w:eastAsia="Georgia"/>
+                <w:b/>
+                <w:i w:val="0"/>
+                <w:sz w:val="18"/>
+              </w:rPr>
+              <w:t>100%</w:t>
+            </w:r>
+          </w:p>
+        </w:tc>
+      </w:tr>
+    </w:tbl>
     <w:p>
       <w:pPr>
         <w:spacing w:line="480" w:lineRule="auto" w:before="0" w:after="0"/>
@@ -749,139 +1485,603 @@
         <w:t>Frequency and Percentage Distribution of Rhetorical Appeal and Directive Subtype Combinations</w:t>
       </w:r>
     </w:p>
-    <w:p>
-      <w:pPr>
-        <w:spacing w:line="480" w:lineRule="auto" w:before="0" w:after="0"/>
-        <w:jc w:val="both"/>
-      </w:pPr>
-      <w:r>
-        <w:rPr>
-          <w:rFonts w:ascii="Georgia" w:hAnsi="Georgia" w:eastAsia="Georgia"/>
-          <w:b w:val="0"/>
-          <w:i w:val="0"/>
-          <w:sz w:val="22"/>
-        </w:rPr>
-        <w:t>Rhetorical Appeal + Directive Subtype</w:t>
-        <w:tab/>
-        <w:t>Frequency</w:t>
-        <w:tab/>
-        <w:t>Percentage</w:t>
-      </w:r>
-    </w:p>
-    <w:p>
-      <w:pPr>
-        <w:spacing w:line="480" w:lineRule="auto" w:before="0" w:after="0"/>
-        <w:jc w:val="both"/>
-      </w:pPr>
-      <w:r>
-        <w:rPr>
-          <w:rFonts w:ascii="Georgia" w:hAnsi="Georgia" w:eastAsia="Georgia"/>
-          <w:b w:val="0"/>
-          <w:i w:val="0"/>
-          <w:sz w:val="22"/>
-        </w:rPr>
-        <w:t>Logos + Order</w:t>
-        <w:tab/>
-        <w:t>15</w:t>
-        <w:tab/>
-        <w:t>44.12%</w:t>
-      </w:r>
-    </w:p>
-    <w:p>
-      <w:pPr>
-        <w:spacing w:line="480" w:lineRule="auto" w:before="0" w:after="0"/>
-        <w:jc w:val="both"/>
-      </w:pPr>
-      <w:r>
-        <w:rPr>
-          <w:rFonts w:ascii="Georgia" w:hAnsi="Georgia" w:eastAsia="Georgia"/>
-          <w:b w:val="0"/>
-          <w:i w:val="0"/>
-          <w:sz w:val="22"/>
-        </w:rPr>
-        <w:t>Pathos + Order</w:t>
-        <w:tab/>
-        <w:t>6</w:t>
-        <w:tab/>
-        <w:t>17.65%</w:t>
-      </w:r>
-    </w:p>
-    <w:p>
-      <w:pPr>
-        <w:spacing w:line="480" w:lineRule="auto" w:before="0" w:after="0"/>
-        <w:jc w:val="both"/>
-      </w:pPr>
-      <w:r>
-        <w:rPr>
-          <w:rFonts w:ascii="Georgia" w:hAnsi="Georgia" w:eastAsia="Georgia"/>
-          <w:b w:val="0"/>
-          <w:i w:val="0"/>
-          <w:sz w:val="22"/>
-        </w:rPr>
-        <w:t>Ethos + Order</w:t>
-        <w:tab/>
-        <w:t>1</w:t>
-        <w:tab/>
-        <w:t>2.94%</w:t>
-      </w:r>
-    </w:p>
-    <w:p>
-      <w:pPr>
-        <w:spacing w:line="480" w:lineRule="auto" w:before="0" w:after="0"/>
-        <w:jc w:val="both"/>
-      </w:pPr>
-      <w:r>
-        <w:rPr>
-          <w:rFonts w:ascii="Georgia" w:hAnsi="Georgia" w:eastAsia="Georgia"/>
-          <w:b w:val="0"/>
-          <w:i w:val="0"/>
-          <w:sz w:val="22"/>
-        </w:rPr>
-        <w:t>Logos + Suggestion</w:t>
-        <w:tab/>
-        <w:t>7</w:t>
-        <w:tab/>
-        <w:t>20.59%</w:t>
-      </w:r>
-    </w:p>
-    <w:p>
-      <w:pPr>
-        <w:spacing w:line="480" w:lineRule="auto" w:before="0" w:after="0"/>
-        <w:jc w:val="both"/>
-      </w:pPr>
-      <w:r>
-        <w:rPr>
-          <w:rFonts w:ascii="Georgia" w:hAnsi="Georgia" w:eastAsia="Georgia"/>
-          <w:b w:val="0"/>
-          <w:i w:val="0"/>
-          <w:sz w:val="22"/>
-        </w:rPr>
-        <w:t>Pathos + Suggestion</w:t>
-        <w:tab/>
-        <w:t>5</w:t>
-        <w:tab/>
-        <w:t>14.71%</w:t>
-      </w:r>
-    </w:p>
-    <w:p>
-      <w:pPr>
-        <w:spacing w:line="480" w:lineRule="auto" w:before="0" w:after="0"/>
-        <w:jc w:val="both"/>
-      </w:pPr>
-      <w:r>
-        <w:rPr>
-          <w:rFonts w:ascii="Georgia" w:hAnsi="Georgia" w:eastAsia="Georgia"/>
-          <w:b w:val="0"/>
-          <w:i w:val="0"/>
-          <w:sz w:val="22"/>
-        </w:rPr>
-        <w:t>Total</w:t>
-        <w:tab/>
-        <w:t>34</w:t>
-        <w:tab/>
-        <w:t>100%</w:t>
-      </w:r>
-    </w:p>
+    <w:tbl>
+      <w:tblPr>
+        <w:tblStyle w:val="TableGrid"/>
+        <w:tblW w:type="auto" w:w="0"/>
+        <w:jc w:val="center"/>
+        <w:tblLook w:firstColumn="1" w:firstRow="1" w:lastColumn="0" w:lastRow="0" w:noHBand="0" w:noVBand="1" w:val="04A0"/>
+      </w:tblPr>
+      <w:tblGrid>
+        <w:gridCol w:w="2880"/>
+        <w:gridCol w:w="2880"/>
+        <w:gridCol w:w="2880"/>
+      </w:tblGrid>
+      <w:tr>
+        <w:tc>
+          <w:tcPr>
+            <w:tcW w:type="dxa" w:w="4608"/>
+            <w:tcBorders>
+              <w:top w:val="single" w:sz="4" w:space="0" w:color="000000"/>
+              <w:left w:val="single" w:sz="4" w:space="0" w:color="000000"/>
+              <w:bottom w:val="single" w:sz="4" w:space="0" w:color="000000"/>
+              <w:right w:val="single" w:sz="4" w:space="0" w:color="000000"/>
+            </w:tcBorders>
+            <w:shd w:fill="D9D9D9" w:val="clear"/>
+          </w:tcPr>
+          <w:p>
+            <w:pPr>
+              <w:spacing w:before="40" w:after="40" w:line="240" w:lineRule="auto"/>
+              <w:jc w:val="center"/>
+            </w:pPr>
+            <w:r/>
+            <w:r>
+              <w:rPr>
+                <w:rFonts w:ascii="Georgia" w:hAnsi="Georgia" w:eastAsia="Georgia"/>
+                <w:b/>
+                <w:i w:val="0"/>
+                <w:sz w:val="18"/>
+              </w:rPr>
+              <w:t>Rhetorical Appeal + Directive Subtype</w:t>
+            </w:r>
+          </w:p>
+        </w:tc>
+        <w:tc>
+          <w:tcPr>
+            <w:tcW w:type="dxa" w:w="1872"/>
+            <w:tcBorders>
+              <w:top w:val="single" w:sz="4" w:space="0" w:color="000000"/>
+              <w:left w:val="single" w:sz="4" w:space="0" w:color="000000"/>
+              <w:bottom w:val="single" w:sz="4" w:space="0" w:color="000000"/>
+              <w:right w:val="single" w:sz="4" w:space="0" w:color="000000"/>
+            </w:tcBorders>
+            <w:shd w:fill="D9D9D9" w:val="clear"/>
+          </w:tcPr>
+          <w:p>
+            <w:pPr>
+              <w:spacing w:before="40" w:after="40" w:line="240" w:lineRule="auto"/>
+              <w:jc w:val="center"/>
+            </w:pPr>
+            <w:r/>
+            <w:r>
+              <w:rPr>
+                <w:rFonts w:ascii="Georgia" w:hAnsi="Georgia" w:eastAsia="Georgia"/>
+                <w:b/>
+                <w:i w:val="0"/>
+                <w:sz w:val="18"/>
+              </w:rPr>
+              <w:t>Frequency</w:t>
+            </w:r>
+          </w:p>
+        </w:tc>
+        <w:tc>
+          <w:tcPr>
+            <w:tcW w:type="dxa" w:w="1872"/>
+            <w:tcBorders>
+              <w:top w:val="single" w:sz="4" w:space="0" w:color="000000"/>
+              <w:left w:val="single" w:sz="4" w:space="0" w:color="000000"/>
+              <w:bottom w:val="single" w:sz="4" w:space="0" w:color="000000"/>
+              <w:right w:val="single" w:sz="4" w:space="0" w:color="000000"/>
+            </w:tcBorders>
+            <w:shd w:fill="D9D9D9" w:val="clear"/>
+          </w:tcPr>
+          <w:p>
+            <w:pPr>
+              <w:spacing w:before="40" w:after="40" w:line="240" w:lineRule="auto"/>
+              <w:jc w:val="center"/>
+            </w:pPr>
+            <w:r/>
+            <w:r>
+              <w:rPr>
+                <w:rFonts w:ascii="Georgia" w:hAnsi="Georgia" w:eastAsia="Georgia"/>
+                <w:b/>
+                <w:i w:val="0"/>
+                <w:sz w:val="18"/>
+              </w:rPr>
+              <w:t>Percentage</w:t>
+            </w:r>
+          </w:p>
+        </w:tc>
+      </w:tr>
+      <w:tr>
+        <w:tc>
+          <w:tcPr>
+            <w:tcW w:type="dxa" w:w="4608"/>
+            <w:tcBorders>
+              <w:top w:val="single" w:sz="4" w:space="0" w:color="000000"/>
+              <w:left w:val="single" w:sz="4" w:space="0" w:color="000000"/>
+              <w:bottom w:val="single" w:sz="4" w:space="0" w:color="000000"/>
+              <w:right w:val="single" w:sz="4" w:space="0" w:color="000000"/>
+            </w:tcBorders>
+          </w:tcPr>
+          <w:p>
+            <w:pPr>
+              <w:spacing w:before="40" w:after="40" w:line="240" w:lineRule="auto"/>
+              <w:jc w:val="center"/>
+            </w:pPr>
+            <w:r/>
+            <w:r>
+              <w:rPr>
+                <w:rFonts w:ascii="Georgia" w:hAnsi="Georgia" w:eastAsia="Georgia"/>
+                <w:b w:val="0"/>
+                <w:i w:val="0"/>
+                <w:sz w:val="18"/>
+              </w:rPr>
+              <w:t>Logos + Order</w:t>
+            </w:r>
+          </w:p>
+        </w:tc>
+        <w:tc>
+          <w:tcPr>
+            <w:tcW w:type="dxa" w:w="1872"/>
+            <w:tcBorders>
+              <w:top w:val="single" w:sz="4" w:space="0" w:color="000000"/>
+              <w:left w:val="single" w:sz="4" w:space="0" w:color="000000"/>
+              <w:bottom w:val="single" w:sz="4" w:space="0" w:color="000000"/>
+              <w:right w:val="single" w:sz="4" w:space="0" w:color="000000"/>
+            </w:tcBorders>
+          </w:tcPr>
+          <w:p>
+            <w:pPr>
+              <w:spacing w:before="40" w:after="40" w:line="240" w:lineRule="auto"/>
+              <w:jc w:val="center"/>
+            </w:pPr>
+            <w:r/>
+            <w:r>
+              <w:rPr>
+                <w:rFonts w:ascii="Georgia" w:hAnsi="Georgia" w:eastAsia="Georgia"/>
+                <w:b w:val="0"/>
+                <w:i w:val="0"/>
+                <w:sz w:val="18"/>
+              </w:rPr>
+              <w:t>15</w:t>
+            </w:r>
+          </w:p>
+        </w:tc>
+        <w:tc>
+          <w:tcPr>
+            <w:tcW w:type="dxa" w:w="1872"/>
+            <w:tcBorders>
+              <w:top w:val="single" w:sz="4" w:space="0" w:color="000000"/>
+              <w:left w:val="single" w:sz="4" w:space="0" w:color="000000"/>
+              <w:bottom w:val="single" w:sz="4" w:space="0" w:color="000000"/>
+              <w:right w:val="single" w:sz="4" w:space="0" w:color="000000"/>
+            </w:tcBorders>
+          </w:tcPr>
+          <w:p>
+            <w:pPr>
+              <w:spacing w:before="40" w:after="40" w:line="240" w:lineRule="auto"/>
+              <w:jc w:val="center"/>
+            </w:pPr>
+            <w:r/>
+            <w:r>
+              <w:rPr>
+                <w:rFonts w:ascii="Georgia" w:hAnsi="Georgia" w:eastAsia="Georgia"/>
+                <w:b w:val="0"/>
+                <w:i w:val="0"/>
+                <w:sz w:val="18"/>
+              </w:rPr>
+              <w:t>44.12%</w:t>
+            </w:r>
+          </w:p>
+        </w:tc>
+      </w:tr>
+      <w:tr>
+        <w:tc>
+          <w:tcPr>
+            <w:tcW w:type="dxa" w:w="4608"/>
+            <w:tcBorders>
+              <w:top w:val="single" w:sz="4" w:space="0" w:color="000000"/>
+              <w:left w:val="single" w:sz="4" w:space="0" w:color="000000"/>
+              <w:bottom w:val="single" w:sz="4" w:space="0" w:color="000000"/>
+              <w:right w:val="single" w:sz="4" w:space="0" w:color="000000"/>
+            </w:tcBorders>
+          </w:tcPr>
+          <w:p>
+            <w:pPr>
+              <w:spacing w:before="40" w:after="40" w:line="240" w:lineRule="auto"/>
+              <w:jc w:val="center"/>
+            </w:pPr>
+            <w:r/>
+            <w:r>
+              <w:rPr>
+                <w:rFonts w:ascii="Georgia" w:hAnsi="Georgia" w:eastAsia="Georgia"/>
+                <w:b w:val="0"/>
+                <w:i w:val="0"/>
+                <w:sz w:val="18"/>
+              </w:rPr>
+              <w:t>Pathos + Order</w:t>
+            </w:r>
+          </w:p>
+        </w:tc>
+        <w:tc>
+          <w:tcPr>
+            <w:tcW w:type="dxa" w:w="1872"/>
+            <w:tcBorders>
+              <w:top w:val="single" w:sz="4" w:space="0" w:color="000000"/>
+              <w:left w:val="single" w:sz="4" w:space="0" w:color="000000"/>
+              <w:bottom w:val="single" w:sz="4" w:space="0" w:color="000000"/>
+              <w:right w:val="single" w:sz="4" w:space="0" w:color="000000"/>
+            </w:tcBorders>
+          </w:tcPr>
+          <w:p>
+            <w:pPr>
+              <w:spacing w:before="40" w:after="40" w:line="240" w:lineRule="auto"/>
+              <w:jc w:val="center"/>
+            </w:pPr>
+            <w:r/>
+            <w:r>
+              <w:rPr>
+                <w:rFonts w:ascii="Georgia" w:hAnsi="Georgia" w:eastAsia="Georgia"/>
+                <w:b w:val="0"/>
+                <w:i w:val="0"/>
+                <w:sz w:val="18"/>
+              </w:rPr>
+              <w:t>6</w:t>
+            </w:r>
+          </w:p>
+        </w:tc>
+        <w:tc>
+          <w:tcPr>
+            <w:tcW w:type="dxa" w:w="1872"/>
+            <w:tcBorders>
+              <w:top w:val="single" w:sz="4" w:space="0" w:color="000000"/>
+              <w:left w:val="single" w:sz="4" w:space="0" w:color="000000"/>
+              <w:bottom w:val="single" w:sz="4" w:space="0" w:color="000000"/>
+              <w:right w:val="single" w:sz="4" w:space="0" w:color="000000"/>
+            </w:tcBorders>
+          </w:tcPr>
+          <w:p>
+            <w:pPr>
+              <w:spacing w:before="40" w:after="40" w:line="240" w:lineRule="auto"/>
+              <w:jc w:val="center"/>
+            </w:pPr>
+            <w:r/>
+            <w:r>
+              <w:rPr>
+                <w:rFonts w:ascii="Georgia" w:hAnsi="Georgia" w:eastAsia="Georgia"/>
+                <w:b w:val="0"/>
+                <w:i w:val="0"/>
+                <w:sz w:val="18"/>
+              </w:rPr>
+              <w:t>17.65%</w:t>
+            </w:r>
+          </w:p>
+        </w:tc>
+      </w:tr>
+      <w:tr>
+        <w:tc>
+          <w:tcPr>
+            <w:tcW w:type="dxa" w:w="4608"/>
+            <w:tcBorders>
+              <w:top w:val="single" w:sz="4" w:space="0" w:color="000000"/>
+              <w:left w:val="single" w:sz="4" w:space="0" w:color="000000"/>
+              <w:bottom w:val="single" w:sz="4" w:space="0" w:color="000000"/>
+              <w:right w:val="single" w:sz="4" w:space="0" w:color="000000"/>
+            </w:tcBorders>
+          </w:tcPr>
+          <w:p>
+            <w:pPr>
+              <w:spacing w:before="40" w:after="40" w:line="240" w:lineRule="auto"/>
+              <w:jc w:val="center"/>
+            </w:pPr>
+            <w:r/>
+            <w:r>
+              <w:rPr>
+                <w:rFonts w:ascii="Georgia" w:hAnsi="Georgia" w:eastAsia="Georgia"/>
+                <w:b w:val="0"/>
+                <w:i w:val="0"/>
+                <w:sz w:val="18"/>
+              </w:rPr>
+              <w:t>Ethos + Order</w:t>
+            </w:r>
+          </w:p>
+        </w:tc>
+        <w:tc>
+          <w:tcPr>
+            <w:tcW w:type="dxa" w:w="1872"/>
+            <w:tcBorders>
+              <w:top w:val="single" w:sz="4" w:space="0" w:color="000000"/>
+              <w:left w:val="single" w:sz="4" w:space="0" w:color="000000"/>
+              <w:bottom w:val="single" w:sz="4" w:space="0" w:color="000000"/>
+              <w:right w:val="single" w:sz="4" w:space="0" w:color="000000"/>
+            </w:tcBorders>
+          </w:tcPr>
+          <w:p>
+            <w:pPr>
+              <w:spacing w:before="40" w:after="40" w:line="240" w:lineRule="auto"/>
+              <w:jc w:val="center"/>
+            </w:pPr>
+            <w:r/>
+            <w:r>
+              <w:rPr>
+                <w:rFonts w:ascii="Georgia" w:hAnsi="Georgia" w:eastAsia="Georgia"/>
+                <w:b w:val="0"/>
+                <w:i w:val="0"/>
+                <w:sz w:val="18"/>
+              </w:rPr>
+              <w:t>1</w:t>
+            </w:r>
+          </w:p>
+        </w:tc>
+        <w:tc>
+          <w:tcPr>
+            <w:tcW w:type="dxa" w:w="1872"/>
+            <w:tcBorders>
+              <w:top w:val="single" w:sz="4" w:space="0" w:color="000000"/>
+              <w:left w:val="single" w:sz="4" w:space="0" w:color="000000"/>
+              <w:bottom w:val="single" w:sz="4" w:space="0" w:color="000000"/>
+              <w:right w:val="single" w:sz="4" w:space="0" w:color="000000"/>
+            </w:tcBorders>
+          </w:tcPr>
+          <w:p>
+            <w:pPr>
+              <w:spacing w:before="40" w:after="40" w:line="240" w:lineRule="auto"/>
+              <w:jc w:val="center"/>
+            </w:pPr>
+            <w:r/>
+            <w:r>
+              <w:rPr>
+                <w:rFonts w:ascii="Georgia" w:hAnsi="Georgia" w:eastAsia="Georgia"/>
+                <w:b w:val="0"/>
+                <w:i w:val="0"/>
+                <w:sz w:val="18"/>
+              </w:rPr>
+              <w:t>2.94%</w:t>
+            </w:r>
+          </w:p>
+        </w:tc>
+      </w:tr>
+      <w:tr>
+        <w:tc>
+          <w:tcPr>
+            <w:tcW w:type="dxa" w:w="4608"/>
+            <w:tcBorders>
+              <w:top w:val="single" w:sz="4" w:space="0" w:color="000000"/>
+              <w:left w:val="single" w:sz="4" w:space="0" w:color="000000"/>
+              <w:bottom w:val="single" w:sz="4" w:space="0" w:color="000000"/>
+              <w:right w:val="single" w:sz="4" w:space="0" w:color="000000"/>
+            </w:tcBorders>
+          </w:tcPr>
+          <w:p>
+            <w:pPr>
+              <w:spacing w:before="40" w:after="40" w:line="240" w:lineRule="auto"/>
+              <w:jc w:val="center"/>
+            </w:pPr>
+            <w:r/>
+            <w:r>
+              <w:rPr>
+                <w:rFonts w:ascii="Georgia" w:hAnsi="Georgia" w:eastAsia="Georgia"/>
+                <w:b w:val="0"/>
+                <w:i w:val="0"/>
+                <w:sz w:val="18"/>
+              </w:rPr>
+              <w:t>Logos + Suggestion</w:t>
+            </w:r>
+          </w:p>
+        </w:tc>
+        <w:tc>
+          <w:tcPr>
+            <w:tcW w:type="dxa" w:w="1872"/>
+            <w:tcBorders>
+              <w:top w:val="single" w:sz="4" w:space="0" w:color="000000"/>
+              <w:left w:val="single" w:sz="4" w:space="0" w:color="000000"/>
+              <w:bottom w:val="single" w:sz="4" w:space="0" w:color="000000"/>
+              <w:right w:val="single" w:sz="4" w:space="0" w:color="000000"/>
+            </w:tcBorders>
+          </w:tcPr>
+          <w:p>
+            <w:pPr>
+              <w:spacing w:before="40" w:after="40" w:line="240" w:lineRule="auto"/>
+              <w:jc w:val="center"/>
+            </w:pPr>
+            <w:r/>
+            <w:r>
+              <w:rPr>
+                <w:rFonts w:ascii="Georgia" w:hAnsi="Georgia" w:eastAsia="Georgia"/>
+                <w:b w:val="0"/>
+                <w:i w:val="0"/>
+                <w:sz w:val="18"/>
+              </w:rPr>
+              <w:t>7</w:t>
+            </w:r>
+          </w:p>
+        </w:tc>
+        <w:tc>
+          <w:tcPr>
+            <w:tcW w:type="dxa" w:w="1872"/>
+            <w:tcBorders>
+              <w:top w:val="single" w:sz="4" w:space="0" w:color="000000"/>
+              <w:left w:val="single" w:sz="4" w:space="0" w:color="000000"/>
+              <w:bottom w:val="single" w:sz="4" w:space="0" w:color="000000"/>
+              <w:right w:val="single" w:sz="4" w:space="0" w:color="000000"/>
+            </w:tcBorders>
+          </w:tcPr>
+          <w:p>
+            <w:pPr>
+              <w:spacing w:before="40" w:after="40" w:line="240" w:lineRule="auto"/>
+              <w:jc w:val="center"/>
+            </w:pPr>
+            <w:r/>
+            <w:r>
+              <w:rPr>
+                <w:rFonts w:ascii="Georgia" w:hAnsi="Georgia" w:eastAsia="Georgia"/>
+                <w:b w:val="0"/>
+                <w:i w:val="0"/>
+                <w:sz w:val="18"/>
+              </w:rPr>
+              <w:t>20.59%</w:t>
+            </w:r>
+          </w:p>
+        </w:tc>
+      </w:tr>
+      <w:tr>
+        <w:tc>
+          <w:tcPr>
+            <w:tcW w:type="dxa" w:w="4608"/>
+            <w:tcBorders>
+              <w:top w:val="single" w:sz="4" w:space="0" w:color="000000"/>
+              <w:left w:val="single" w:sz="4" w:space="0" w:color="000000"/>
+              <w:bottom w:val="single" w:sz="4" w:space="0" w:color="000000"/>
+              <w:right w:val="single" w:sz="4" w:space="0" w:color="000000"/>
+            </w:tcBorders>
+          </w:tcPr>
+          <w:p>
+            <w:pPr>
+              <w:spacing w:before="40" w:after="40" w:line="240" w:lineRule="auto"/>
+              <w:jc w:val="center"/>
+            </w:pPr>
+            <w:r/>
+            <w:r>
+              <w:rPr>
+                <w:rFonts w:ascii="Georgia" w:hAnsi="Georgia" w:eastAsia="Georgia"/>
+                <w:b w:val="0"/>
+                <w:i w:val="0"/>
+                <w:sz w:val="18"/>
+              </w:rPr>
+              <w:t>Pathos + Suggestion</w:t>
+            </w:r>
+          </w:p>
+        </w:tc>
+        <w:tc>
+          <w:tcPr>
+            <w:tcW w:type="dxa" w:w="1872"/>
+            <w:tcBorders>
+              <w:top w:val="single" w:sz="4" w:space="0" w:color="000000"/>
+              <w:left w:val="single" w:sz="4" w:space="0" w:color="000000"/>
+              <w:bottom w:val="single" w:sz="4" w:space="0" w:color="000000"/>
+              <w:right w:val="single" w:sz="4" w:space="0" w:color="000000"/>
+            </w:tcBorders>
+          </w:tcPr>
+          <w:p>
+            <w:pPr>
+              <w:spacing w:before="40" w:after="40" w:line="240" w:lineRule="auto"/>
+              <w:jc w:val="center"/>
+            </w:pPr>
+            <w:r/>
+            <w:r>
+              <w:rPr>
+                <w:rFonts w:ascii="Georgia" w:hAnsi="Georgia" w:eastAsia="Georgia"/>
+                <w:b w:val="0"/>
+                <w:i w:val="0"/>
+                <w:sz w:val="18"/>
+              </w:rPr>
+              <w:t>5</w:t>
+            </w:r>
+          </w:p>
+        </w:tc>
+        <w:tc>
+          <w:tcPr>
+            <w:tcW w:type="dxa" w:w="1872"/>
+            <w:tcBorders>
+              <w:top w:val="single" w:sz="4" w:space="0" w:color="000000"/>
+              <w:left w:val="single" w:sz="4" w:space="0" w:color="000000"/>
+              <w:bottom w:val="single" w:sz="4" w:space="0" w:color="000000"/>
+              <w:right w:val="single" w:sz="4" w:space="0" w:color="000000"/>
+            </w:tcBorders>
+          </w:tcPr>
+          <w:p>
+            <w:pPr>
+              <w:spacing w:before="40" w:after="40" w:line="240" w:lineRule="auto"/>
+              <w:jc w:val="center"/>
+            </w:pPr>
+            <w:r/>
+            <w:r>
+              <w:rPr>
+                <w:rFonts w:ascii="Georgia" w:hAnsi="Georgia" w:eastAsia="Georgia"/>
+                <w:b w:val="0"/>
+                <w:i w:val="0"/>
+                <w:sz w:val="18"/>
+              </w:rPr>
+              <w:t>14.71%</w:t>
+            </w:r>
+          </w:p>
+        </w:tc>
+      </w:tr>
+      <w:tr>
+        <w:tc>
+          <w:tcPr>
+            <w:tcW w:type="dxa" w:w="4608"/>
+            <w:tcBorders>
+              <w:top w:val="single" w:sz="4" w:space="0" w:color="000000"/>
+              <w:left w:val="single" w:sz="4" w:space="0" w:color="000000"/>
+              <w:bottom w:val="single" w:sz="4" w:space="0" w:color="000000"/>
+              <w:right w:val="single" w:sz="4" w:space="0" w:color="000000"/>
+            </w:tcBorders>
+          </w:tcPr>
+          <w:p>
+            <w:pPr>
+              <w:spacing w:before="40" w:after="40" w:line="240" w:lineRule="auto"/>
+              <w:jc w:val="center"/>
+            </w:pPr>
+            <w:r/>
+            <w:r>
+              <w:rPr>
+                <w:rFonts w:ascii="Georgia" w:hAnsi="Georgia" w:eastAsia="Georgia"/>
+                <w:b/>
+                <w:i w:val="0"/>
+                <w:sz w:val="18"/>
+              </w:rPr>
+              <w:t>Total</w:t>
+            </w:r>
+          </w:p>
+        </w:tc>
+        <w:tc>
+          <w:tcPr>
+            <w:tcW w:type="dxa" w:w="1872"/>
+            <w:tcBorders>
+              <w:top w:val="single" w:sz="4" w:space="0" w:color="000000"/>
+              <w:left w:val="single" w:sz="4" w:space="0" w:color="000000"/>
+              <w:bottom w:val="single" w:sz="4" w:space="0" w:color="000000"/>
+              <w:right w:val="single" w:sz="4" w:space="0" w:color="000000"/>
+            </w:tcBorders>
+          </w:tcPr>
+          <w:p>
+            <w:pPr>
+              <w:spacing w:before="40" w:after="40" w:line="240" w:lineRule="auto"/>
+              <w:jc w:val="center"/>
+            </w:pPr>
+            <w:r/>
+            <w:r>
+              <w:rPr>
+                <w:rFonts w:ascii="Georgia" w:hAnsi="Georgia" w:eastAsia="Georgia"/>
+                <w:b/>
+                <w:i w:val="0"/>
+                <w:sz w:val="18"/>
+              </w:rPr>
+              <w:t>34</w:t>
+            </w:r>
+          </w:p>
+        </w:tc>
+        <w:tc>
+          <w:tcPr>
+            <w:tcW w:type="dxa" w:w="1872"/>
+            <w:tcBorders>
+              <w:top w:val="single" w:sz="4" w:space="0" w:color="000000"/>
+              <w:left w:val="single" w:sz="4" w:space="0" w:color="000000"/>
+              <w:bottom w:val="single" w:sz="4" w:space="0" w:color="000000"/>
+              <w:right w:val="single" w:sz="4" w:space="0" w:color="000000"/>
+            </w:tcBorders>
+          </w:tcPr>
+          <w:p>
+            <w:pPr>
+              <w:spacing w:before="40" w:after="40" w:line="240" w:lineRule="auto"/>
+              <w:jc w:val="center"/>
+            </w:pPr>
+            <w:r/>
+            <w:r>
+              <w:rPr>
+                <w:rFonts w:ascii="Georgia" w:hAnsi="Georgia" w:eastAsia="Georgia"/>
+                <w:b/>
+                <w:i w:val="0"/>
+                <w:sz w:val="18"/>
+              </w:rPr>
+              <w:t>100%</w:t>
+            </w:r>
+          </w:p>
+        </w:tc>
+      </w:tr>
+    </w:tbl>
     <w:p>
       <w:pPr>
         <w:spacing w:line="480" w:lineRule="auto" w:before="0" w:after="0"/>

</xml_diff>

<commit_message>
Velasquez Ch3: subtler ELS framing (no banner announcements), match hedge thesis style
</commit_message>
<xml_diff>
--- a/thesis/Velasquez/Chapter3_Results_Analysis_Discussion_Draft_001.docx
+++ b/thesis/Velasquez/Chapter3_Results_Analysis_Discussion_Draft_001.docx
@@ -32,7 +32,7 @@
           <w:sz w:val="22"/>
           <w:highlight w:val="yellow"/>
         </w:rPr>
-        <w:t>This chapter presents the results, analysis, and discussion of the rhetorical appeals and directive subtypes identified in the call-to-action (CTA) phrases of Facebook skincare advertisement captions. As an English Language Studies project, the chapter treats those findings as patterns in English use: how short commercial utterances encode persuasive appeals and perform directive acts. The chapter is organized into three parts, each corresponding to a research question. Part I presents the rhetorical appeals identified in the CTA phrases. Part II examines the directive subtypes present in the CTA phrases. Part III discusses how directive subtypes and rhetorical appeals contribute to the construction of persuasive meaning in the CTA phrases.</w:t>
+        <w:t>This chapter presents the results, analysis, and discussion of the rhetorical appeals and directive subtypes identified in the call-to-action (CTA) phrases of Facebook skincare advertisement captions. The focus is on how those short commercial utterances encode persuasive appeals and perform directive acts. The chapter is organized into three parts, each corresponding to a research question. Part I presents the rhetorical appeals identified in the CTA phrases. Part II examines the directive subtypes present in the CTA phrases. Part III discusses how directive subtypes and rhetorical appeals contribute to the construction of persuasive meaning in the CTA phrases.</w:t>
       </w:r>
     </w:p>
     <w:p>
@@ -543,8 +543,9 @@
           <w:b w:val="0"/>
           <w:i w:val="0"/>
           <w:sz w:val="22"/>
+          <w:highlight w:val="yellow"/>
         </w:rPr>
-        <w:t>Table 1 shows that logos had the highest frequency, with 22 instances (64.71%), followed by pathos with 11 instances (32.35%). Ethos had the lowest frequency, with only one instance (2.94%). Each of the 34 CTA phrases was classified according to its dominant rhetorical appeal. From an English Language Studies perspective, this distribution describes how persuasive English is worded in the sample: product-related information and stated benefits supply the main textual basis for persuasion more often than emotional or credibility-framed wording.</w:t>
+        <w:t>Table 1 shows that logos had the highest frequency, with 22 instances (64.71%), followed by pathos with 11 instances (32.35%). Ethos had the lowest frequency, with only one instance (2.94%). Each of the 34 CTA phrases was classified according to its dominant rhetorical appeal. In this sample, product-related information and stated benefits supply the main textual basis for persuasion more often than emotional or credibility-framed wording.</w:t>
       </w:r>
     </w:p>
     <w:p>
@@ -561,7 +562,7 @@
           <w:sz w:val="22"/>
           <w:highlight w:val="yellow"/>
         </w:rPr>
-        <w:t>A closer examination of logos across the five brands showed that The Ordinary had the highest frequency, with seven instances. Luxe Organix and Pond’s followed with five instances each, while Olay had three and Myra had two. The captions associated with these CTA phrases commonly presented product ingredients, features, numerical information, stated benefits, prices, and usage instructions. For example, Olay used “Get the power of 5 serum benefits in just one bottle!” where the number “5” and the reference to serum benefits provide specific product-related information. Luxe Organix captions likewise presented ingredients, sun protection, product functions, and prices. These elements supported classification under logos because they offer reasons for considering the product. That reading is consistent with logos as persuasion through logical reasoning or argument (Stanford Encyclopedia of Philosophy, 2022) and with digital-advertising analyses that locate logos in facts, specifications, and product data (Nasir et al., 2025).</w:t>
+        <w:t>These elements supported classification under logos because they offer reasons for considering the product. That reading is consistent with logos as persuasion through logical reasoning or argument (Rapp, 2022) and with analyses that locate logos in facts, specifications, and product data in social-media advertising language (Nasir et al., 2025).</w:t>
       </w:r>
     </w:p>
     <w:p>
@@ -578,7 +579,7 @@
           <w:sz w:val="22"/>
           <w:highlight w:val="yellow"/>
         </w:rPr>
-        <w:t>Pathos was identified in 11 CTA phrases. Olay and Myra had four instances each, followed by Luxe Organix with two and Pond’s with one. No CTA phrase from The Ordinary was classified under pathos. Captions in this group used expressions related to desirable skin conditions, emotional associations, promotional excitement, and urgency—for example Olay’s “Wrap your skin in love,” “glowy, refreshed skin,” and “Don’t miss out!”; Luxe Organix’s “Want to achieve a youthful skin?”; and Myra’s “Give her the gift of youthful radiance.” Such wording appeals to desire, care, and urgency. Beauty-advertising research often finds pathos realized through aspirational appearance and affective framing (Dwiyanti, 2024). In English terms, pathos here is carried by evaluative lexis (youthful, glow, radiance) and interpersonal frames (gift, love, miss out).</w:t>
+        <w:t>Such wording appeals to desire, care, and urgency. Beauty-advertising research often finds pathos realized through aspirational appearance and affective framing (Dwiyanti, 2024). Pathos here is carried by evaluative lexis (youthful, glow, radiance) and interpersonal frames (gift, love, miss out).</w:t>
       </w:r>
     </w:p>
     <w:p>
@@ -595,7 +596,7 @@
           <w:sz w:val="22"/>
           <w:highlight w:val="yellow"/>
         </w:rPr>
-        <w:t>Ethos was identified in only one CTA phrase, from Myra: “Myra’s trusted skincare essentials,” where trusted supplies an explicit credibility cue. By contrast, “made by Myra” in another advertisement was not treated as ethos merely because it named the brand; accompanying words such as Glow and Radiance supported a pathos reading instead. Classification therefore rested on textual evidence of trustworthiness, not on brand identification alone. That distinction follows the definition of ethos as an appeal based on credibility (Stanford Encyclopedia of Philosophy, 2022) and keeps the coding rule available for defense: form alone does not equal function.</w:t>
+        <w:t>Classification therefore rested on textual evidence of trustworthiness, not on brand identification alone. That distinction follows the definition of ethos as an appeal based on credibility (Rapp, 2022): naming the brand is not the same as establishing trust in the wording.</w:t>
       </w:r>
     </w:p>
     <w:p>
@@ -629,7 +630,7 @@
           <w:sz w:val="22"/>
           <w:highlight w:val="yellow"/>
         </w:rPr>
-        <w:t>Overall, logos, pathos, and ethos were all present in the selected captions. Logos was the most frequent appeal, followed by pathos and ethos. For English Language Studies, the main point is not market effectiveness but wording: in this corpus, persuasive English in skincare CTAs most often builds on product information and stated benefits, with emotional and credibility resources used more selectively.</w:t>
+        <w:t>Overall, logos, pathos, and ethos were all present in the selected captions. Logos was the most frequent appeal, followed by pathos and ethos. The pattern is one of wording rather than market effect: in this corpus, skincare CTAs most often build persuasion on product information and stated benefits, with emotional and credibility resources used more selectively.</w:t>
       </w:r>
     </w:p>
     <w:p>
@@ -1286,8 +1287,9 @@
           <w:b w:val="0"/>
           <w:i w:val="0"/>
           <w:sz w:val="22"/>
+          <w:highlight w:val="yellow"/>
         </w:rPr>
-        <w:t>Table 3 shows that order was the most frequent subtype (22 instances; 64.71%), followed by suggestion (12; 35.29%). No command or request was identified. Orders appeared across all five brands; suggestions varied by brand. Parallel work on beauty captions has likewise found directive language used to encourage purchase and engagement, often through commands, suggestions, invitations, and advice (e.g., analyses of NIVEA Instagram captions using Searle’s framework). In English Language Studies terms, the CTA is not only promotional copy; it is an utterance that performs a social action.</w:t>
+        <w:t>Parallel work on beauty captions has likewise found directive language used to encourage purchase and engagement, often through commands, suggestions, invitations, and advice (e.g., analyses of NIVEA Instagram captions using Searle’s framework). The CTA is treated here as an utterance that performs a social action, not only as promotional copy.</w:t>
       </w:r>
     </w:p>
     <w:p>
@@ -1321,7 +1323,7 @@
           <w:sz w:val="22"/>
           <w:highlight w:val="yellow"/>
         </w:rPr>
-        <w:t>Suggestion was identified in 12 CTA phrases, most often in Myra and Pond’s, with fewer cases in The Ordinary and Luxe Organix, and none in Olay. These expressions encouraged consumers to consider trying a product, incorporating it into a routine, or pursuing a desired result—for example Luxe Organix’s “Try this newest Niacinamide + Retinol cloudsoap!,” The Ordinary’s “Power Up Your P.M.,” and Myra’s “Give her the gift of youthful radiance with Myra Ultimate.” Under the operational definitions adopted from Anggraini and Afriana (2023), suggestion proposes a course of action while leaving the hearer room to accept or refuse it. The English of suggestion in this corpus often retains an imperative surface (Try, Give, Experience) but carries lower directive force than order.</w:t>
+        <w:t>Under the operational definitions adopted from Anggraini and Afriana (2023), suggestion proposes a course of action while leaving the hearer room to accept or refuse it. Suggestion in this corpus often retains an imperative surface (Try, Give, Experience) but carries lower directive force than order.</w:t>
       </w:r>
     </w:p>
     <w:p>
@@ -1355,7 +1357,7 @@
           <w:sz w:val="22"/>
           <w:highlight w:val="yellow"/>
         </w:rPr>
-        <w:t>Overall, order dominated and suggestion was secondary. For English Language Studies, the finding answers the second research question as a distribution of illocutionary subtypes in English CTA phrases: the selected advertisements mainly use direct instruction and, less often, recommended consideration. Command and request were available in the scheme but did not appear in the data.</w:t>
+        <w:t>Overall, order dominated and suggestion was secondary. The second research question is answered as a distribution of illocutionary subtypes in the CTA phrases: the selected advertisements mainly use direct instruction and, less often, recommended consideration. Command and request were available in the scheme but did not appear in the data.</w:t>
       </w:r>
     </w:p>
     <w:p>
@@ -1449,8 +1451,9 @@
           <w:b w:val="0"/>
           <w:i w:val="0"/>
           <w:sz w:val="22"/>
+          <w:highlight w:val="yellow"/>
         </w:rPr>
-        <w:t>Part III examines how rhetorical appeals and directive subtypes combine in the 34 CTA phrases. The analysis treats persuasive meaning as jointly constructed: the appeal supplies a reason, emotion, or credibility frame in English, while the directive subtype supplies the illocutionary force that seeks audience action. Table 5 presents the frequency and percentage distribution of these combinations.</w:t>
+        <w:t>Part III examines how rhetorical appeals and directive subtypes combine in the 34 CTA phrases. Persuasive meaning is treated as jointly constructed: the appeal supplies a reason, emotion, or credibility frame, while the directive subtype supplies the illocutionary force that seeks audience action. Table 5 presents the frequency and percentage distribution of these combinations.</w:t>
       </w:r>
     </w:p>
     <w:p>
@@ -2113,7 +2116,7 @@
           <w:sz w:val="22"/>
           <w:highlight w:val="yellow"/>
         </w:rPr>
-        <w:t>Logos + Order, found in Olay, Luxe Organix, The Ordinary, and Pond’s, pairs product-related information with a direct instruction. English in this combination typically offers a product reason (ingredient, benefit, SPF, price) and simultaneously performs an order (Shop now, Apply, Discover). Logos supplies the informational basis; order directs the intended action. Logos + Suggestion, found in The Ordinary, Myra, and Pond’s, keeps the informational basis but softens the directive to an action the consumer may consider. Pathos + Order links desirable outcomes or affective frames with direct instruction, while Pathos + Suggestion links those frames with invited consideration. Ethos + Order appeared once in Myra, where explicit trust language accompanied a direct instruction. In each case, persuasive meaning is not appeal alone or directive alone; it is the English packaging of both in one CTA unit.</w:t>
+        <w:t>This combination typically offers a product reason (ingredient, benefit, SPF, price) and simultaneously performs an order (Shop now, Apply, Discover). Logos supplies the informational basis; order directs the intended action. Logos + Suggestion, found in The Ordinary, Myra, and Pond’s, keeps the informational basis but softens the directive to an action the consumer may consider. Pathos + Order links desirable outcomes or affective frames with direct instruction, while Pathos + Suggestion links those frames with invited consideration. Ethos + Order appeared once in Myra, where explicit trust language accompanied a direct instruction. In each case, persuasive meaning is not appeal alone or directive alone; it is the packaging of both in one CTA unit.</w:t>
       </w:r>
     </w:p>
     <w:p>
@@ -2130,7 +2133,7 @@
           <w:sz w:val="22"/>
           <w:highlight w:val="yellow"/>
         </w:rPr>
-        <w:t>Brand-level patterns refine the picture without changing the overall claim. Olay combined pathos or logos with order only. The Ordinary stayed within logos, paired with order or suggestion. Myra showed the widest mix, including the sole ethos case and a higher share of suggestion. Pond’s and Luxe Organix mixed logos- and pathos-based combinations. These are patterns of English choice in caption writing, not measures of campaign success.</w:t>
+        <w:t>Brand-level patterns refine the picture without changing the overall claim. Olay combined pathos or logos with order only. The Ordinary stayed within logos, paired with order or suggestion. Myra showed the widest mix, including the sole ethos case and a higher share of suggestion. Pond’s and Luxe Organix mixed logos- and pathos-based combinations. These are patterns of caption wording, not measures of campaign success.</w:t>
       </w:r>
     </w:p>
     <w:p>
@@ -2147,7 +2150,7 @@
           <w:sz w:val="22"/>
           <w:highlight w:val="yellow"/>
         </w:rPr>
-        <w:t>Overall, persuasive meaning in the selected Facebook skincare advertisements was constructed through the combination of rhetorical appeals and directive subtypes. Logos presented product-related information, pathos appealed to feelings and desired appearance, and ethos conveyed credibility when the wording supported it. Orders directed specific actions; suggestions invited consideration. As an English Language Studies analysis, the chapter accounts for how those resources are worded and what illocutionary work they do. It does not establish whether consumers purchased or used the products.</w:t>
+        <w:t>Overall, persuasive meaning in the selected Facebook skincare advertisements was constructed through the combination of rhetorical appeals and directive subtypes. Logos presented product-related information, pathos appealed to feelings and desired appearance, and ethos conveyed credibility when the wording supported it. Orders directed specific actions; suggestions invited consideration. The account is of how those resources are worded and what illocutionary work they do. It does not establish whether consumers purchased or used the products.</w:t>
       </w:r>
     </w:p>
     <w:p>

</xml_diff>

<commit_message>
Velasquez Ch3: drop RQ-answered meta announcements
</commit_message>
<xml_diff>
--- a/thesis/Velasquez/Chapter3_Results_Analysis_Discussion_Draft_001.docx
+++ b/thesis/Velasquez/Chapter3_Results_Analysis_Discussion_Draft_001.docx
@@ -1357,7 +1357,7 @@
           <w:sz w:val="22"/>
           <w:highlight w:val="yellow"/>
         </w:rPr>
-        <w:t>Overall, order dominated and suggestion was secondary. The second research question is answered as a distribution of illocutionary subtypes in the CTA phrases: the selected advertisements mainly use direct instruction and, less often, recommended consideration. Command and request were available in the scheme but did not appear in the data.</w:t>
+        <w:t>Overall, order dominated and suggestion was secondary. The selected advertisements mainly use direct instruction and, less often, recommended consideration. Command and request were available in the scheme but did not appear in the data.</w:t>
       </w:r>
     </w:p>
     <w:p>
@@ -2150,7 +2150,7 @@
           <w:sz w:val="22"/>
           <w:highlight w:val="yellow"/>
         </w:rPr>
-        <w:t>Overall, persuasive meaning in the selected Facebook skincare advertisements was constructed through the combination of rhetorical appeals and directive subtypes. Logos presented product-related information, pathos appealed to feelings and desired appearance, and ethos conveyed credibility when the wording supported it. Orders directed specific actions; suggestions invited consideration. The account is of how those resources are worded and what illocutionary work they do. It does not establish whether consumers purchased or used the products.</w:t>
+        <w:t>Overall, persuasive meaning in the selected Facebook skincare advertisements was constructed through the combination of rhetorical appeals and directive subtypes. Logos presented product-related information, pathos appealed to feelings and desired appearance, and ethos conveyed credibility when the wording supported it. Orders directed specific actions; suggestions invited consideration. The analysis does not establish whether consumers purchased or used the products.</w:t>
       </w:r>
     </w:p>
     <w:p>

</xml_diff>

<commit_message>
Velasquez Ch3: clear yellow highlights (too broad)
</commit_message>
<xml_diff>
--- a/thesis/Velasquez/Chapter3_Results_Analysis_Discussion_Draft_001.docx
+++ b/thesis/Velasquez/Chapter3_Results_Analysis_Discussion_Draft_001.docx
@@ -30,7 +30,6 @@
           <w:b w:val="0"/>
           <w:i w:val="0"/>
           <w:sz w:val="22"/>
-          <w:highlight w:val="yellow"/>
         </w:rPr>
         <w:t>This chapter presents the results, analysis, and discussion of the rhetorical appeals and directive subtypes identified in the call-to-action (CTA) phrases of Facebook skincare advertisement captions. The focus is on how those short commercial utterances encode persuasive appeals and perform directive acts. The chapter is organized into three parts, each corresponding to a research question. Part I presents the rhetorical appeals identified in the CTA phrases. Part II examines the directive subtypes present in the CTA phrases. Part III discusses how directive subtypes and rhetorical appeals contribute to the construction of persuasive meaning in the CTA phrases.</w:t>
       </w:r>
@@ -63,7 +62,6 @@
           <w:b w:val="0"/>
           <w:i w:val="0"/>
           <w:sz w:val="22"/>
-          <w:highlight w:val="yellow"/>
         </w:rPr>
         <w:t>The coding identified three rhetorical appeals across the 34 call-to-action (CTA) phrases from the selected Facebook skincare advertisement captions. These appeals were classified as logos, pathos, and ethos based on Aristotle’s rhetorical framework, in which logos appeals to reason, pathos to emotion, and ethos to credibility (Stanford Encyclopedia of Philosophy, 2022). In identifying the dominant rhetorical appeal, the full advertisement caption was examined for textual evidence, while the CTA phrase remained the primary unit of analysis. Table 1 presents the distribution of rhetorical appeals across the five selected skincare brands.</w:t>
       </w:r>
@@ -543,7 +541,6 @@
           <w:b w:val="0"/>
           <w:i w:val="0"/>
           <w:sz w:val="22"/>
-          <w:highlight w:val="yellow"/>
         </w:rPr>
         <w:t>Table 1 shows that logos had the highest frequency, with 22 instances (64.71%), followed by pathos with 11 instances (32.35%). Ethos had the lowest frequency, with only one instance (2.94%). Each of the 34 CTA phrases was classified according to its dominant rhetorical appeal. In this sample, product-related information and stated benefits supply the main textual basis for persuasion more often than emotional or credibility-framed wording.</w:t>
       </w:r>
@@ -560,7 +557,6 @@
           <w:b w:val="0"/>
           <w:i w:val="0"/>
           <w:sz w:val="22"/>
-          <w:highlight w:val="yellow"/>
         </w:rPr>
         <w:t>These elements supported classification under logos because they offer reasons for considering the product. That reading is consistent with logos as persuasion through logical reasoning or argument (Rapp, 2022) and with analyses that locate logos in facts, specifications, and product data in social-media advertising language (Nasir et al., 2025).</w:t>
       </w:r>
@@ -577,7 +573,6 @@
           <w:b w:val="0"/>
           <w:i w:val="0"/>
           <w:sz w:val="22"/>
-          <w:highlight w:val="yellow"/>
         </w:rPr>
         <w:t>Such wording appeals to desire, care, and urgency. Beauty-advertising research often finds pathos realized through aspirational appearance and affective framing (Dwiyanti, 2024). Pathos here is carried by evaluative lexis (youthful, glow, radiance) and interpersonal frames (gift, love, miss out).</w:t>
       </w:r>
@@ -594,7 +589,6 @@
           <w:b w:val="0"/>
           <w:i w:val="0"/>
           <w:sz w:val="22"/>
-          <w:highlight w:val="yellow"/>
         </w:rPr>
         <w:t>Classification therefore rested on textual evidence of trustworthiness, not on brand identification alone. That distinction follows the definition of ethos as an appeal based on credibility (Rapp, 2022): naming the brand is not the same as establishing trust in the wording.</w:t>
       </w:r>
@@ -611,7 +605,6 @@
           <w:b w:val="0"/>
           <w:i w:val="0"/>
           <w:sz w:val="22"/>
-          <w:highlight w:val="yellow"/>
         </w:rPr>
         <w:t>The findings can be compared with Dwiyanti (2024), who examined persuasive techniques in makeup and skincare video advertisements and found pathos most frequent, with logos and ethos less common. The present study found logos dominant. The difference is better read as a difference in material and unit of analysis—short CTA-centered Facebook captions versus multimodal video advertisements—than as a claim that the platform itself caused the shift. Philippine Facebook advertising work has also shown ethos and pathos operating strongly in other product sectors (De Castro &amp; Martinez, 2025; Talaue, 2022), which further suggests that rhetorical distribution tracks discourse type and coding focus as much as product category.</w:t>
       </w:r>
@@ -628,7 +621,6 @@
           <w:b w:val="0"/>
           <w:i w:val="0"/>
           <w:sz w:val="22"/>
-          <w:highlight w:val="yellow"/>
         </w:rPr>
         <w:t>Overall, logos, pathos, and ethos were all present in the selected captions. Logos was the most frequent appeal, followed by pathos and ethos. The pattern is one of wording rather than market effect: in this corpus, skincare CTAs most often build persuasion on product information and stated benefits, with emotional and credibility resources used more selectively.</w:t>
       </w:r>
@@ -724,7 +716,6 @@
           <w:b w:val="0"/>
           <w:i w:val="0"/>
           <w:sz w:val="22"/>
-          <w:highlight w:val="yellow"/>
         </w:rPr>
         <w:t>The coding identified two directive subtypes across the 34 CTA phrases: order and suggestion. Four subtypes were available in the framework—command, order, request, and suggestion—following Yule (1996) as operationalized by Anggraini and Afriana (2023). Directives, in Searle’s taxonomy, are illocutionary acts through which the speaker attempts to get the hearer to do something (Searle, 1975, 1976). Table 3 presents the distribution of directive subtypes across the five brands.</w:t>
       </w:r>
@@ -1287,7 +1278,6 @@
           <w:b w:val="0"/>
           <w:i w:val="0"/>
           <w:sz w:val="22"/>
-          <w:highlight w:val="yellow"/>
         </w:rPr>
         <w:t>Parallel work on beauty captions has likewise found directive language used to encourage purchase and engagement, often through commands, suggestions, invitations, and advice (e.g., analyses of NIVEA Instagram captions using Searle’s framework). The CTA is treated here as an utterance that performs a social action, not only as promotional copy.</w:t>
       </w:r>
@@ -1304,7 +1294,6 @@
           <w:b w:val="0"/>
           <w:i w:val="0"/>
           <w:sz w:val="22"/>
-          <w:highlight w:val="yellow"/>
         </w:rPr>
         <w:t>Orders directed consumers toward concrete commercial actions: checking out products, shopping, choosing from a range, adding items to a cart, exploring a website, applying a product, or obtaining an item online. Examples include Olay’s “Shop now at Watsons, S&amp;R, Robinsons Department Store, Landmark Department Store, Shopee and Lazada” and The Ordinary’s “Discover now via theordinary.com.” These were classified as orders because they directly instruct the audience to perform a specific action. Advertising research on imperatives notes that commercial directives often take short, verb-led English forms and that their force may function more like instruction or recommendation than institutional command (Pennock-Speck &amp; Fuster-Márquez, 2014).</w:t>
       </w:r>
@@ -1321,7 +1310,6 @@
           <w:b w:val="0"/>
           <w:i w:val="0"/>
           <w:sz w:val="22"/>
-          <w:highlight w:val="yellow"/>
         </w:rPr>
         <w:t>Under the operational definitions adopted from Anggraini and Afriana (2023), suggestion proposes a course of action while leaving the hearer room to accept or refuse it. Suggestion in this corpus often retains an imperative surface (Try, Give, Experience) but carries lower directive force than order.</w:t>
       </w:r>
@@ -1338,7 +1326,6 @@
           <w:b w:val="0"/>
           <w:i w:val="0"/>
           <w:sz w:val="22"/>
-          <w:highlight w:val="yellow"/>
         </w:rPr>
         <w:t>No instances of command or request met the operational criteria. Command, in the adopted framework, implies a stronger authority asymmetry; request implies a more polite ask. Commercial Facebook CTAs in this sample clustered instead on order and suggestion. That pattern is consistent with advertising English that prefers clear action prompts without the interpersonal softening typical of polite requests or the institutional force of true commands (Pennock-Speck &amp; Fuster-Márquez, 2014).</w:t>
       </w:r>
@@ -1355,7 +1342,6 @@
           <w:b w:val="0"/>
           <w:i w:val="0"/>
           <w:sz w:val="22"/>
-          <w:highlight w:val="yellow"/>
         </w:rPr>
         <w:t>Overall, order dominated and suggestion was secondary. The selected advertisements mainly use direct instruction and, less often, recommended consideration. Command and request were available in the scheme but did not appear in the data.</w:t>
       </w:r>
@@ -1451,7 +1437,6 @@
           <w:b w:val="0"/>
           <w:i w:val="0"/>
           <w:sz w:val="22"/>
-          <w:highlight w:val="yellow"/>
         </w:rPr>
         <w:t>Part III examines how rhetorical appeals and directive subtypes combine in the 34 CTA phrases. Persuasive meaning is treated as jointly constructed: the appeal supplies a reason, emotion, or credibility frame, while the directive subtype supplies the illocutionary force that seeks audience action. Table 5 presents the frequency and percentage distribution of these combinations.</w:t>
       </w:r>
@@ -2097,7 +2082,6 @@
           <w:b w:val="0"/>
           <w:i w:val="0"/>
           <w:sz w:val="22"/>
-          <w:highlight w:val="yellow"/>
         </w:rPr>
         <w:t>Logos + Order was the most frequent combination (15; 44.12%), followed by Logos + Suggestion (7; 20.59%), Pathos + Order (6; 17.65%), Pathos + Suggestion (5; 14.71%), and Ethos + Order (1; 2.94%). Studies that integrate rhetorical appeals with speech-act analysis in cosmetics and social-media advertising similarly treat persuasion as multi-layered: ads both argue and direct (Saad &amp; Ismael, 2025; related work on social-media cosmetics advertising). The present distribution specifies how that layering appears in English CTA phrases for five skincare brands on Facebook.</w:t>
       </w:r>
@@ -2114,7 +2098,6 @@
           <w:b w:val="0"/>
           <w:i w:val="0"/>
           <w:sz w:val="22"/>
-          <w:highlight w:val="yellow"/>
         </w:rPr>
         <w:t>This combination typically offers a product reason (ingredient, benefit, SPF, price) and simultaneously performs an order (Shop now, Apply, Discover). Logos supplies the informational basis; order directs the intended action. Logos + Suggestion, found in The Ordinary, Myra, and Pond’s, keeps the informational basis but softens the directive to an action the consumer may consider. Pathos + Order links desirable outcomes or affective frames with direct instruction, while Pathos + Suggestion links those frames with invited consideration. Ethos + Order appeared once in Myra, where explicit trust language accompanied a direct instruction. In each case, persuasive meaning is not appeal alone or directive alone; it is the packaging of both in one CTA unit.</w:t>
       </w:r>
@@ -2131,7 +2114,6 @@
           <w:b w:val="0"/>
           <w:i w:val="0"/>
           <w:sz w:val="22"/>
-          <w:highlight w:val="yellow"/>
         </w:rPr>
         <w:t>Brand-level patterns refine the picture without changing the overall claim. Olay combined pathos or logos with order only. The Ordinary stayed within logos, paired with order or suggestion. Myra showed the widest mix, including the sole ethos case and a higher share of suggestion. Pond’s and Luxe Organix mixed logos- and pathos-based combinations. These are patterns of caption wording, not measures of campaign success.</w:t>
       </w:r>
@@ -2148,7 +2130,6 @@
           <w:b w:val="0"/>
           <w:i w:val="0"/>
           <w:sz w:val="22"/>
-          <w:highlight w:val="yellow"/>
         </w:rPr>
         <w:t>Overall, persuasive meaning in the selected Facebook skincare advertisements was constructed through the combination of rhetorical appeals and directive subtypes. Logos presented product-related information, pathos appealed to feelings and desired appearance, and ethos conveyed credibility when the wording supported it. Orders directed specific actions; suggestions invited consideration. The analysis does not establish whether consumers purchased or used the products.</w:t>
       </w:r>

</xml_diff>

<commit_message>
Velasquez Ch3: highlight only new phrases and citations
</commit_message>
<xml_diff>
--- a/thesis/Velasquez/Chapter3_Results_Analysis_Discussion_Draft_001.docx
+++ b/thesis/Velasquez/Chapter3_Results_Analysis_Discussion_Draft_001.docx
@@ -26,12 +26,25 @@
       </w:pPr>
       <w:r>
         <w:rPr>
-          <w:rFonts w:ascii="Georgia" w:hAnsi="Georgia" w:eastAsia="Georgia"/>
-          <w:b w:val="0"/>
-          <w:i w:val="0"/>
+          <w:rFonts w:ascii="Georgia" w:hAnsi="Georgia"/>
           <w:sz w:val="22"/>
         </w:rPr>
-        <w:t>This chapter presents the results, analysis, and discussion of the rhetorical appeals and directive subtypes identified in the call-to-action (CTA) phrases of Facebook skincare advertisement captions. The focus is on how those short commercial utterances encode persuasive appeals and perform directive acts. The chapter is organized into three parts, each corresponding to a research question. Part I presents the rhetorical appeals identified in the CTA phrases. Part II examines the directive subtypes present in the CTA phrases. Part III discusses how directive subtypes and rhetorical appeals contribute to the construction of persuasive meaning in the CTA phrases.</w:t>
+        <w:t xml:space="preserve">This chapter presents the results, analysis, and discussion of the rhetorical appeals and directive subtypes identified in the call-to-action (CTA) phrases of Facebook skincare advertisement captions. The focus is on how those </w:t>
+      </w:r>
+      <w:r>
+        <w:rPr>
+          <w:rFonts w:ascii="Georgia" w:hAnsi="Georgia"/>
+          <w:sz w:val="22"/>
+          <w:highlight w:val="yellow"/>
+        </w:rPr>
+        <w:t>short commercial utterances encode persuasive appeals and perform directive acts</w:t>
+      </w:r>
+      <w:r>
+        <w:rPr>
+          <w:rFonts w:ascii="Georgia" w:hAnsi="Georgia"/>
+          <w:sz w:val="22"/>
+        </w:rPr>
+        <w:t>. The chapter is organized into three parts, each corresponding to a research question. Part I presents the rhetorical appeals identified in the CTA phrases. Part II examines the directive subtypes present in the CTA phrases. Part III discusses how directive subtypes and rhetorical appeals contribute to the construction of persuasive meaning in the CTA phrases.</w:t>
       </w:r>
     </w:p>
     <w:p>
@@ -553,12 +566,40 @@
       </w:pPr>
       <w:r>
         <w:rPr>
-          <w:rFonts w:ascii="Georgia" w:hAnsi="Georgia" w:eastAsia="Georgia"/>
-          <w:b w:val="0"/>
-          <w:i w:val="0"/>
+          <w:rFonts w:ascii="Georgia" w:hAnsi="Georgia"/>
           <w:sz w:val="22"/>
         </w:rPr>
-        <w:t>These elements supported classification under logos because they offer reasons for considering the product. That reading is consistent with logos as persuasion through logical reasoning or argument (Rapp, 2022) and with analyses that locate logos in facts, specifications, and product data in social-media advertising language (Nasir et al., 2025).</w:t>
+        <w:t>These elements supported classification under logos because they offer reasons for considering the product. That reading is consistent with logos as persuasion through logical reasoning or argument (</w:t>
+      </w:r>
+      <w:r>
+        <w:rPr>
+          <w:rFonts w:ascii="Georgia" w:hAnsi="Georgia"/>
+          <w:sz w:val="22"/>
+          <w:highlight w:val="yellow"/>
+        </w:rPr>
+        <w:t>Rapp, 2022</w:t>
+      </w:r>
+      <w:r>
+        <w:rPr>
+          <w:rFonts w:ascii="Georgia" w:hAnsi="Georgia"/>
+          <w:sz w:val="22"/>
+        </w:rPr>
+        <w:t>) and with analyses that locate logos in facts, specifications, and product data in social-media advertising language (</w:t>
+      </w:r>
+      <w:r>
+        <w:rPr>
+          <w:rFonts w:ascii="Georgia" w:hAnsi="Georgia"/>
+          <w:sz w:val="22"/>
+          <w:highlight w:val="yellow"/>
+        </w:rPr>
+        <w:t>Nasir et al., 2025</w:t>
+      </w:r>
+      <w:r>
+        <w:rPr>
+          <w:rFonts w:ascii="Georgia" w:hAnsi="Georgia"/>
+          <w:sz w:val="22"/>
+        </w:rPr>
+        <w:t>).</w:t>
       </w:r>
     </w:p>
     <w:p>
@@ -569,12 +610,25 @@
       </w:pPr>
       <w:r>
         <w:rPr>
-          <w:rFonts w:ascii="Georgia" w:hAnsi="Georgia" w:eastAsia="Georgia"/>
-          <w:b w:val="0"/>
-          <w:i w:val="0"/>
+          <w:rFonts w:ascii="Georgia" w:hAnsi="Georgia"/>
           <w:sz w:val="22"/>
         </w:rPr>
-        <w:t>Such wording appeals to desire, care, and urgency. Beauty-advertising research often finds pathos realized through aspirational appearance and affective framing (Dwiyanti, 2024). Pathos here is carried by evaluative lexis (youthful, glow, radiance) and interpersonal frames (gift, love, miss out).</w:t>
+        <w:t xml:space="preserve">Such wording appeals to desire, care, and urgency. Beauty-advertising research often finds pathos realized through aspirational appearance and affective framing (Dwiyanti, 2024). Pathos here is carried by </w:t>
+      </w:r>
+      <w:r>
+        <w:rPr>
+          <w:rFonts w:ascii="Georgia" w:hAnsi="Georgia"/>
+          <w:sz w:val="22"/>
+          <w:highlight w:val="yellow"/>
+        </w:rPr>
+        <w:t>evaluative lexis (youthful, glow, radiance) and interpersonal frames (gift, love, miss out)</w:t>
+      </w:r>
+      <w:r>
+        <w:rPr>
+          <w:rFonts w:ascii="Georgia" w:hAnsi="Georgia"/>
+          <w:sz w:val="22"/>
+        </w:rPr>
+        <w:t>.</w:t>
       </w:r>
     </w:p>
     <w:p>
@@ -585,12 +639,40 @@
       </w:pPr>
       <w:r>
         <w:rPr>
-          <w:rFonts w:ascii="Georgia" w:hAnsi="Georgia" w:eastAsia="Georgia"/>
-          <w:b w:val="0"/>
-          <w:i w:val="0"/>
+          <w:rFonts w:ascii="Georgia" w:hAnsi="Georgia"/>
           <w:sz w:val="22"/>
         </w:rPr>
-        <w:t>Classification therefore rested on textual evidence of trustworthiness, not on brand identification alone. That distinction follows the definition of ethos as an appeal based on credibility (Rapp, 2022): naming the brand is not the same as establishing trust in the wording.</w:t>
+        <w:t>Classification therefore rested on textual evidence of trustworthiness, not on brand identification alone. That distinction follows the definition of ethos as an appeal based on credibility (</w:t>
+      </w:r>
+      <w:r>
+        <w:rPr>
+          <w:rFonts w:ascii="Georgia" w:hAnsi="Georgia"/>
+          <w:sz w:val="22"/>
+          <w:highlight w:val="yellow"/>
+        </w:rPr>
+        <w:t>Rapp, 2022</w:t>
+      </w:r>
+      <w:r>
+        <w:rPr>
+          <w:rFonts w:ascii="Georgia" w:hAnsi="Georgia"/>
+          <w:sz w:val="22"/>
+        </w:rPr>
+        <w:t xml:space="preserve">): </w:t>
+      </w:r>
+      <w:r>
+        <w:rPr>
+          <w:rFonts w:ascii="Georgia" w:hAnsi="Georgia"/>
+          <w:sz w:val="22"/>
+          <w:highlight w:val="yellow"/>
+        </w:rPr>
+        <w:t>naming the brand is not the same as establishing trust in the wording</w:t>
+      </w:r>
+      <w:r>
+        <w:rPr>
+          <w:rFonts w:ascii="Georgia" w:hAnsi="Georgia"/>
+          <w:sz w:val="22"/>
+        </w:rPr>
+        <w:t>.</w:t>
       </w:r>
     </w:p>
     <w:p>
@@ -601,12 +683,70 @@
       </w:pPr>
       <w:r>
         <w:rPr>
-          <w:rFonts w:ascii="Georgia" w:hAnsi="Georgia" w:eastAsia="Georgia"/>
-          <w:b w:val="0"/>
-          <w:i w:val="0"/>
+          <w:rFonts w:ascii="Georgia" w:hAnsi="Georgia"/>
           <w:sz w:val="22"/>
         </w:rPr>
-        <w:t>The findings can be compared with Dwiyanti (2024), who examined persuasive techniques in makeup and skincare video advertisements and found pathos most frequent, with logos and ethos less common. The present study found logos dominant. The difference is better read as a difference in material and unit of analysis—short CTA-centered Facebook captions versus multimodal video advertisements—than as a claim that the platform itself caused the shift. Philippine Facebook advertising work has also shown ethos and pathos operating strongly in other product sectors (De Castro &amp; Martinez, 2025; Talaue, 2022), which further suggests that rhetorical distribution tracks discourse type and coding focus as much as product category.</w:t>
+        <w:t xml:space="preserve">The findings can be compared with Dwiyanti (2024), who examined persuasive techniques in makeup and skincare video advertisements and found pathos most frequent, with logos and ethos less common. The present study found logos dominant. The difference is better read as a difference in </w:t>
+      </w:r>
+      <w:r>
+        <w:rPr>
+          <w:rFonts w:ascii="Georgia" w:hAnsi="Georgia"/>
+          <w:sz w:val="22"/>
+          <w:highlight w:val="yellow"/>
+        </w:rPr>
+        <w:t>material and unit of analysis—short CTA-centered Facebook captions versus multimodal video advertisements—than as a claim that the platform itself caused the shift</w:t>
+      </w:r>
+      <w:r>
+        <w:rPr>
+          <w:rFonts w:ascii="Georgia" w:hAnsi="Georgia"/>
+          <w:sz w:val="22"/>
+        </w:rPr>
+        <w:t>. Philippine Facebook advertising work has also shown ethos and pathos operating strongly in other product sectors (</w:t>
+      </w:r>
+      <w:r>
+        <w:rPr>
+          <w:rFonts w:ascii="Georgia" w:hAnsi="Georgia"/>
+          <w:sz w:val="22"/>
+          <w:highlight w:val="yellow"/>
+        </w:rPr>
+        <w:t>De Castro &amp; Martinez, 2025</w:t>
+      </w:r>
+      <w:r>
+        <w:rPr>
+          <w:rFonts w:ascii="Georgia" w:hAnsi="Georgia"/>
+          <w:sz w:val="22"/>
+        </w:rPr>
+        <w:t xml:space="preserve">; </w:t>
+      </w:r>
+      <w:r>
+        <w:rPr>
+          <w:rFonts w:ascii="Georgia" w:hAnsi="Georgia"/>
+          <w:sz w:val="22"/>
+          <w:highlight w:val="yellow"/>
+        </w:rPr>
+        <w:t>Talaue, 2022</w:t>
+      </w:r>
+      <w:r>
+        <w:rPr>
+          <w:rFonts w:ascii="Georgia" w:hAnsi="Georgia"/>
+          <w:sz w:val="22"/>
+        </w:rPr>
+        <w:t xml:space="preserve">), which further suggests that </w:t>
+      </w:r>
+      <w:r>
+        <w:rPr>
+          <w:rFonts w:ascii="Georgia" w:hAnsi="Georgia"/>
+          <w:sz w:val="22"/>
+          <w:highlight w:val="yellow"/>
+        </w:rPr>
+        <w:t>rhetorical distribution tracks discourse type and coding focus as much as product category</w:t>
+      </w:r>
+      <w:r>
+        <w:rPr>
+          <w:rFonts w:ascii="Georgia" w:hAnsi="Georgia"/>
+          <w:sz w:val="22"/>
+        </w:rPr>
+        <w:t>.</w:t>
       </w:r>
     </w:p>
     <w:p>
@@ -617,12 +757,25 @@
       </w:pPr>
       <w:r>
         <w:rPr>
-          <w:rFonts w:ascii="Georgia" w:hAnsi="Georgia" w:eastAsia="Georgia"/>
-          <w:b w:val="0"/>
-          <w:i w:val="0"/>
+          <w:rFonts w:ascii="Georgia" w:hAnsi="Georgia"/>
           <w:sz w:val="22"/>
         </w:rPr>
-        <w:t>Overall, logos, pathos, and ethos were all present in the selected captions. Logos was the most frequent appeal, followed by pathos and ethos. The pattern is one of wording rather than market effect: in this corpus, skincare CTAs most often build persuasion on product information and stated benefits, with emotional and credibility resources used more selectively.</w:t>
+        <w:t xml:space="preserve">Overall, logos, pathos, and ethos were all present in the selected captions. Logos was the most frequent appeal, followed by pathos and ethos. The pattern is one of </w:t>
+      </w:r>
+      <w:r>
+        <w:rPr>
+          <w:rFonts w:ascii="Georgia" w:hAnsi="Georgia"/>
+          <w:sz w:val="22"/>
+          <w:highlight w:val="yellow"/>
+        </w:rPr>
+        <w:t>wording rather than market effect</w:t>
+      </w:r>
+      <w:r>
+        <w:rPr>
+          <w:rFonts w:ascii="Georgia" w:hAnsi="Georgia"/>
+          <w:sz w:val="22"/>
+        </w:rPr>
+        <w:t>: in this corpus, skincare CTAs most often build persuasion on product information and stated benefits, with emotional and credibility resources used more selectively.</w:t>
       </w:r>
     </w:p>
     <w:p>
@@ -712,12 +865,25 @@
       </w:pPr>
       <w:r>
         <w:rPr>
-          <w:rFonts w:ascii="Georgia" w:hAnsi="Georgia" w:eastAsia="Georgia"/>
-          <w:b w:val="0"/>
-          <w:i w:val="0"/>
+          <w:rFonts w:ascii="Georgia" w:hAnsi="Georgia"/>
           <w:sz w:val="22"/>
         </w:rPr>
-        <w:t>The coding identified two directive subtypes across the 34 CTA phrases: order and suggestion. Four subtypes were available in the framework—command, order, request, and suggestion—following Yule (1996) as operationalized by Anggraini and Afriana (2023). Directives, in Searle’s taxonomy, are illocutionary acts through which the speaker attempts to get the hearer to do something (Searle, 1975, 1976). Table 3 presents the distribution of directive subtypes across the five brands.</w:t>
+        <w:t>The coding identified two directive subtypes across the 34 CTA phrases: order and suggestion. Four subtypes were available in the framework—command, order, request, and suggestion—following Yule (1996) as operationalized by Anggraini and Afriana (2023). Directives, in Searle’s taxonomy, are illocutionary acts through which the speaker attempts to get the hearer to do something (</w:t>
+      </w:r>
+      <w:r>
+        <w:rPr>
+          <w:rFonts w:ascii="Georgia" w:hAnsi="Georgia"/>
+          <w:sz w:val="22"/>
+          <w:highlight w:val="yellow"/>
+        </w:rPr>
+        <w:t>Searle, 1975, 1976</w:t>
+      </w:r>
+      <w:r>
+        <w:rPr>
+          <w:rFonts w:ascii="Georgia" w:hAnsi="Georgia"/>
+          <w:sz w:val="22"/>
+        </w:rPr>
+        <w:t>). Table 3 presents the distribution of directive subtypes across the five brands.</w:t>
       </w:r>
     </w:p>
     <w:p>
@@ -1274,12 +1440,25 @@
       </w:pPr>
       <w:r>
         <w:rPr>
-          <w:rFonts w:ascii="Georgia" w:hAnsi="Georgia" w:eastAsia="Georgia"/>
-          <w:b w:val="0"/>
-          <w:i w:val="0"/>
+          <w:rFonts w:ascii="Georgia" w:hAnsi="Georgia"/>
           <w:sz w:val="22"/>
         </w:rPr>
-        <w:t>Parallel work on beauty captions has likewise found directive language used to encourage purchase and engagement, often through commands, suggestions, invitations, and advice (e.g., analyses of NIVEA Instagram captions using Searle’s framework). The CTA is treated here as an utterance that performs a social action, not only as promotional copy.</w:t>
+        <w:t xml:space="preserve">Parallel work on beauty captions has likewise found directive language used to encourage purchase and engagement, often through commands, suggestions, invitations, and advice (e.g., analyses of NIVEA Instagram captions using Searle’s framework). The CTA is treated here as an </w:t>
+      </w:r>
+      <w:r>
+        <w:rPr>
+          <w:rFonts w:ascii="Georgia" w:hAnsi="Georgia"/>
+          <w:sz w:val="22"/>
+          <w:highlight w:val="yellow"/>
+        </w:rPr>
+        <w:t>utterance that performs a social action, not only as promotional copy</w:t>
+      </w:r>
+      <w:r>
+        <w:rPr>
+          <w:rFonts w:ascii="Georgia" w:hAnsi="Georgia"/>
+          <w:sz w:val="22"/>
+        </w:rPr>
+        <w:t>.</w:t>
       </w:r>
     </w:p>
     <w:p>
@@ -1290,12 +1469,40 @@
       </w:pPr>
       <w:r>
         <w:rPr>
-          <w:rFonts w:ascii="Georgia" w:hAnsi="Georgia" w:eastAsia="Georgia"/>
-          <w:b w:val="0"/>
-          <w:i w:val="0"/>
+          <w:rFonts w:ascii="Georgia" w:hAnsi="Georgia"/>
           <w:sz w:val="22"/>
         </w:rPr>
-        <w:t>Orders directed consumers toward concrete commercial actions: checking out products, shopping, choosing from a range, adding items to a cart, exploring a website, applying a product, or obtaining an item online. Examples include Olay’s “Shop now at Watsons, S&amp;R, Robinsons Department Store, Landmark Department Store, Shopee and Lazada” and The Ordinary’s “Discover now via theordinary.com.” These were classified as orders because they directly instruct the audience to perform a specific action. Advertising research on imperatives notes that commercial directives often take short, verb-led English forms and that their force may function more like instruction or recommendation than institutional command (Pennock-Speck &amp; Fuster-Márquez, 2014).</w:t>
+        <w:t xml:space="preserve">Orders directed consumers toward concrete commercial actions: checking out products, shopping, choosing from a range, adding items to a cart, exploring a website, applying a product, or obtaining an item online. Examples include Olay’s “Shop now at Watsons, S&amp;R, Robinsons Department Store, Landmark Department Store, Shopee and Lazada” and The Ordinary’s “Discover now via theordinary.com.” These were classified as orders because they directly instruct the audience to perform a specific action. Advertising research on imperatives notes that commercial directives often take short, verb-led English forms and that their </w:t>
+      </w:r>
+      <w:r>
+        <w:rPr>
+          <w:rFonts w:ascii="Georgia" w:hAnsi="Georgia"/>
+          <w:sz w:val="22"/>
+          <w:highlight w:val="yellow"/>
+        </w:rPr>
+        <w:t>force may function more like instruction or recommendation than institutional command</w:t>
+      </w:r>
+      <w:r>
+        <w:rPr>
+          <w:rFonts w:ascii="Georgia" w:hAnsi="Georgia"/>
+          <w:sz w:val="22"/>
+        </w:rPr>
+        <w:t xml:space="preserve"> (</w:t>
+      </w:r>
+      <w:r>
+        <w:rPr>
+          <w:rFonts w:ascii="Georgia" w:hAnsi="Georgia"/>
+          <w:sz w:val="22"/>
+          <w:highlight w:val="yellow"/>
+        </w:rPr>
+        <w:t>Pennock-Speck &amp; Fuster-Márquez, 2014</w:t>
+      </w:r>
+      <w:r>
+        <w:rPr>
+          <w:rFonts w:ascii="Georgia" w:hAnsi="Georgia"/>
+          <w:sz w:val="22"/>
+        </w:rPr>
+        <w:t>).</w:t>
       </w:r>
     </w:p>
     <w:p>
@@ -1306,12 +1513,25 @@
       </w:pPr>
       <w:r>
         <w:rPr>
-          <w:rFonts w:ascii="Georgia" w:hAnsi="Georgia" w:eastAsia="Georgia"/>
-          <w:b w:val="0"/>
-          <w:i w:val="0"/>
+          <w:rFonts w:ascii="Georgia" w:hAnsi="Georgia"/>
           <w:sz w:val="22"/>
         </w:rPr>
-        <w:t>Under the operational definitions adopted from Anggraini and Afriana (2023), suggestion proposes a course of action while leaving the hearer room to accept or refuse it. Suggestion in this corpus often retains an imperative surface (Try, Give, Experience) but carries lower directive force than order.</w:t>
+        <w:t xml:space="preserve">Under the operational definitions adopted from Anggraini and Afriana (2023), suggestion proposes a course of action while leaving the hearer room to accept or refuse it. Suggestion in this corpus often retains an </w:t>
+      </w:r>
+      <w:r>
+        <w:rPr>
+          <w:rFonts w:ascii="Georgia" w:hAnsi="Georgia"/>
+          <w:sz w:val="22"/>
+          <w:highlight w:val="yellow"/>
+        </w:rPr>
+        <w:t>imperative surface (Try, Give, Experience) but carries lower directive force than order</w:t>
+      </w:r>
+      <w:r>
+        <w:rPr>
+          <w:rFonts w:ascii="Georgia" w:hAnsi="Georgia"/>
+          <w:sz w:val="22"/>
+        </w:rPr>
+        <w:t>.</w:t>
       </w:r>
     </w:p>
     <w:p>
@@ -1322,12 +1542,25 @@
       </w:pPr>
       <w:r>
         <w:rPr>
-          <w:rFonts w:ascii="Georgia" w:hAnsi="Georgia" w:eastAsia="Georgia"/>
-          <w:b w:val="0"/>
-          <w:i w:val="0"/>
+          <w:rFonts w:ascii="Georgia" w:hAnsi="Georgia"/>
           <w:sz w:val="22"/>
         </w:rPr>
-        <w:t>No instances of command or request met the operational criteria. Command, in the adopted framework, implies a stronger authority asymmetry; request implies a more polite ask. Commercial Facebook CTAs in this sample clustered instead on order and suggestion. That pattern is consistent with advertising English that prefers clear action prompts without the interpersonal softening typical of polite requests or the institutional force of true commands (Pennock-Speck &amp; Fuster-Márquez, 2014).</w:t>
+        <w:t>No instances of command or request met the operational criteria. Command, in the adopted framework, implies a stronger authority asymmetry; request implies a more polite ask. Commercial Facebook CTAs in this sample clustered instead on order and suggestion. That pattern is consistent with advertising English that prefers clear action prompts without the interpersonal softening typical of polite requests or the institutional force of true commands (</w:t>
+      </w:r>
+      <w:r>
+        <w:rPr>
+          <w:rFonts w:ascii="Georgia" w:hAnsi="Georgia"/>
+          <w:sz w:val="22"/>
+          <w:highlight w:val="yellow"/>
+        </w:rPr>
+        <w:t>Pennock-Speck &amp; Fuster-Márquez, 2014</w:t>
+      </w:r>
+      <w:r>
+        <w:rPr>
+          <w:rFonts w:ascii="Georgia" w:hAnsi="Georgia"/>
+          <w:sz w:val="22"/>
+        </w:rPr>
+        <w:t>).</w:t>
       </w:r>
     </w:p>
     <w:p>
@@ -1433,12 +1666,25 @@
       </w:pPr>
       <w:r>
         <w:rPr>
-          <w:rFonts w:ascii="Georgia" w:hAnsi="Georgia" w:eastAsia="Georgia"/>
-          <w:b w:val="0"/>
-          <w:i w:val="0"/>
+          <w:rFonts w:ascii="Georgia" w:hAnsi="Georgia"/>
           <w:sz w:val="22"/>
         </w:rPr>
-        <w:t>Part III examines how rhetorical appeals and directive subtypes combine in the 34 CTA phrases. Persuasive meaning is treated as jointly constructed: the appeal supplies a reason, emotion, or credibility frame, while the directive subtype supplies the illocutionary force that seeks audience action. Table 5 presents the frequency and percentage distribution of these combinations.</w:t>
+        <w:t xml:space="preserve">Part III examines how rhetorical appeals and directive subtypes combine in the 34 CTA phrases. Persuasive meaning is treated as </w:t>
+      </w:r>
+      <w:r>
+        <w:rPr>
+          <w:rFonts w:ascii="Georgia" w:hAnsi="Georgia"/>
+          <w:sz w:val="22"/>
+          <w:highlight w:val="yellow"/>
+        </w:rPr>
+        <w:t>jointly constructed: the appeal supplies a reason, emotion, or credibility frame, while the directive subtype supplies the illocutionary force that seeks audience action</w:t>
+      </w:r>
+      <w:r>
+        <w:rPr>
+          <w:rFonts w:ascii="Georgia" w:hAnsi="Georgia"/>
+          <w:sz w:val="22"/>
+        </w:rPr>
+        <w:t>. Table 5 presents the frequency and percentage distribution of these combinations.</w:t>
       </w:r>
     </w:p>
     <w:p>
@@ -2078,12 +2324,40 @@
       </w:pPr>
       <w:r>
         <w:rPr>
-          <w:rFonts w:ascii="Georgia" w:hAnsi="Georgia" w:eastAsia="Georgia"/>
-          <w:b w:val="0"/>
-          <w:i w:val="0"/>
+          <w:rFonts w:ascii="Georgia" w:hAnsi="Georgia"/>
           <w:sz w:val="22"/>
         </w:rPr>
-        <w:t>Logos + Order was the most frequent combination (15; 44.12%), followed by Logos + Suggestion (7; 20.59%), Pathos + Order (6; 17.65%), Pathos + Suggestion (5; 14.71%), and Ethos + Order (1; 2.94%). Studies that integrate rhetorical appeals with speech-act analysis in cosmetics and social-media advertising similarly treat persuasion as multi-layered: ads both argue and direct (Saad &amp; Ismael, 2025; related work on social-media cosmetics advertising). The present distribution specifies how that layering appears in English CTA phrases for five skincare brands on Facebook.</w:t>
+        <w:t xml:space="preserve">Logos + Order was the most frequent combination (15; 44.12%), followed by Logos + Suggestion (7; 20.59%), Pathos + Order (6; 17.65%), Pathos + Suggestion (5; 14.71%), and Ethos + Order (1; 2.94%). Studies that integrate rhetorical appeals with speech-act analysis in cosmetics and social-media advertising similarly treat persuasion as multi-layered: </w:t>
+      </w:r>
+      <w:r>
+        <w:rPr>
+          <w:rFonts w:ascii="Georgia" w:hAnsi="Georgia"/>
+          <w:sz w:val="22"/>
+          <w:highlight w:val="yellow"/>
+        </w:rPr>
+        <w:t>ads both argue and direct</w:t>
+      </w:r>
+      <w:r>
+        <w:rPr>
+          <w:rFonts w:ascii="Georgia" w:hAnsi="Georgia"/>
+          <w:sz w:val="22"/>
+        </w:rPr>
+        <w:t xml:space="preserve"> (</w:t>
+      </w:r>
+      <w:r>
+        <w:rPr>
+          <w:rFonts w:ascii="Georgia" w:hAnsi="Georgia"/>
+          <w:sz w:val="22"/>
+          <w:highlight w:val="yellow"/>
+        </w:rPr>
+        <w:t>Saad &amp; Ismael, 2025</w:t>
+      </w:r>
+      <w:r>
+        <w:rPr>
+          <w:rFonts w:ascii="Georgia" w:hAnsi="Georgia"/>
+          <w:sz w:val="22"/>
+        </w:rPr>
+        <w:t>; related work on social-media cosmetics advertising). The present distribution specifies how that layering appears in English CTA phrases for five skincare brands on Facebook.</w:t>
       </w:r>
     </w:p>
     <w:p>
@@ -2094,12 +2368,25 @@
       </w:pPr>
       <w:r>
         <w:rPr>
-          <w:rFonts w:ascii="Georgia" w:hAnsi="Georgia" w:eastAsia="Georgia"/>
-          <w:b w:val="0"/>
-          <w:i w:val="0"/>
+          <w:rFonts w:ascii="Georgia" w:hAnsi="Georgia"/>
           <w:sz w:val="22"/>
         </w:rPr>
-        <w:t>This combination typically offers a product reason (ingredient, benefit, SPF, price) and simultaneously performs an order (Shop now, Apply, Discover). Logos supplies the informational basis; order directs the intended action. Logos + Suggestion, found in The Ordinary, Myra, and Pond’s, keeps the informational basis but softens the directive to an action the consumer may consider. Pathos + Order links desirable outcomes or affective frames with direct instruction, while Pathos + Suggestion links those frames with invited consideration. Ethos + Order appeared once in Myra, where explicit trust language accompanied a direct instruction. In each case, persuasive meaning is not appeal alone or directive alone; it is the packaging of both in one CTA unit.</w:t>
+        <w:t xml:space="preserve">This combination typically offers a product reason (ingredient, benefit, SPF, price) and simultaneously performs an order (Shop now, Apply, Discover). Logos supplies the informational basis; order directs the intended action. Logos + Suggestion, found in The Ordinary, Myra, and Pond’s, keeps the informational basis but softens the directive to an action the consumer may consider. Pathos + Order links desirable outcomes or affective frames with direct instruction, while Pathos + Suggestion links those frames with invited consideration. Ethos + Order appeared once in Myra, where explicit trust language accompanied a direct instruction. In each case, persuasive meaning is not appeal alone or directive alone; it is the </w:t>
+      </w:r>
+      <w:r>
+        <w:rPr>
+          <w:rFonts w:ascii="Georgia" w:hAnsi="Georgia"/>
+          <w:sz w:val="22"/>
+          <w:highlight w:val="yellow"/>
+        </w:rPr>
+        <w:t>packaging of both in one CTA unit</w:t>
+      </w:r>
+      <w:r>
+        <w:rPr>
+          <w:rFonts w:ascii="Georgia" w:hAnsi="Georgia"/>
+          <w:sz w:val="22"/>
+        </w:rPr>
+        <w:t>.</w:t>
       </w:r>
     </w:p>
     <w:p>
@@ -2110,12 +2397,25 @@
       </w:pPr>
       <w:r>
         <w:rPr>
-          <w:rFonts w:ascii="Georgia" w:hAnsi="Georgia" w:eastAsia="Georgia"/>
-          <w:b w:val="0"/>
-          <w:i w:val="0"/>
+          <w:rFonts w:ascii="Georgia" w:hAnsi="Georgia"/>
           <w:sz w:val="22"/>
         </w:rPr>
-        <w:t>Brand-level patterns refine the picture without changing the overall claim. Olay combined pathos or logos with order only. The Ordinary stayed within logos, paired with order or suggestion. Myra showed the widest mix, including the sole ethos case and a higher share of suggestion. Pond’s and Luxe Organix mixed logos- and pathos-based combinations. These are patterns of caption wording, not measures of campaign success.</w:t>
+        <w:t xml:space="preserve">Brand-level patterns refine the picture without changing the overall claim. Olay combined pathos or logos with order only. The Ordinary stayed within logos, paired with order or suggestion. Myra showed the widest mix, including the sole ethos case and a higher share of suggestion. Pond’s and Luxe Organix mixed logos- and pathos-based combinations. These are </w:t>
+      </w:r>
+      <w:r>
+        <w:rPr>
+          <w:rFonts w:ascii="Georgia" w:hAnsi="Georgia"/>
+          <w:sz w:val="22"/>
+          <w:highlight w:val="yellow"/>
+        </w:rPr>
+        <w:t>patterns of caption wording, not measures of campaign success</w:t>
+      </w:r>
+      <w:r>
+        <w:rPr>
+          <w:rFonts w:ascii="Georgia" w:hAnsi="Georgia"/>
+          <w:sz w:val="22"/>
+        </w:rPr>
+        <w:t>.</w:t>
       </w:r>
     </w:p>
     <w:p>

</xml_diff>

<commit_message>
Velasquez Ch3: retone body to match full thesis and pre-edit Chapter 3
</commit_message>
<xml_diff>
--- a/thesis/Velasquez/Chapter3_Results_Analysis_Discussion_Draft_001.docx
+++ b/thesis/Velasquez/Chapter3_Results_Analysis_Discussion_Draft_001.docx
@@ -26,25 +26,10 @@
       </w:pPr>
       <w:r>
         <w:rPr>
-          <w:rFonts w:ascii="Georgia" w:hAnsi="Georgia"/>
+          <w:rFonts w:ascii="Georgia" w:hAnsi="Georgia" w:eastAsia="Georgia"/>
           <w:sz w:val="22"/>
         </w:rPr>
-        <w:t xml:space="preserve">This chapter presents the results, analysis, and discussion of the rhetorical appeals and directive subtypes identified in the call-to-action (CTA) phrases of Facebook skincare advertisement captions. The focus is on how those </w:t>
-      </w:r>
-      <w:r>
-        <w:rPr>
-          <w:rFonts w:ascii="Georgia" w:hAnsi="Georgia"/>
-          <w:sz w:val="22"/>
-          <w:highlight w:val="yellow"/>
-        </w:rPr>
-        <w:t>short commercial utterances encode persuasive appeals and perform directive acts</w:t>
-      </w:r>
-      <w:r>
-        <w:rPr>
-          <w:rFonts w:ascii="Georgia" w:hAnsi="Georgia"/>
-          <w:sz w:val="22"/>
-        </w:rPr>
-        <w:t>. The chapter is organized into three parts, each corresponding to a research question. Part I presents the rhetorical appeals identified in the CTA phrases. Part II examines the directive subtypes present in the CTA phrases. Part III discusses how directive subtypes and rhetorical appeals contribute to the construction of persuasive meaning in the CTA phrases.</w:t>
+        <w:t>This section presents the results, analysis, and discussion of the rhetorical appeals and directive subtypes identified in the call-to-action (CTA) phrases of Facebook skincare advertisement captions. The chapter is organized into three parts, each corresponding to a research question. Part I presents the rhetorical appeals identified in the CTA phrases. Part II examines the directive subtypes present in the CTA phrases. Part III discusses how the directive subtypes and rhetorical appeals contribute to the construction of persuasive meaning in the CTA phrases.</w:t>
       </w:r>
     </w:p>
     <w:p>
@@ -72,11 +57,9 @@
       <w:r>
         <w:rPr>
           <w:rFonts w:ascii="Georgia" w:hAnsi="Georgia" w:eastAsia="Georgia"/>
-          <w:b w:val="0"/>
-          <w:i w:val="0"/>
           <w:sz w:val="22"/>
         </w:rPr>
-        <w:t>The coding identified three rhetorical appeals across the 34 call-to-action (CTA) phrases from the selected Facebook skincare advertisement captions. These appeals were classified as logos, pathos, and ethos based on Aristotle’s rhetorical framework, in which logos appeals to reason, pathos to emotion, and ethos to credibility (Stanford Encyclopedia of Philosophy, 2022). In identifying the dominant rhetorical appeal, the full advertisement caption was examined for textual evidence, while the CTA phrase remained the primary unit of analysis. Table 1 presents the distribution of rhetorical appeals across the five selected skincare brands.</w:t>
+        <w:t>The coding identified three rhetorical appeals across the 34 call-to-action (CTA) phrases from the selected Facebook skincare advertisement captions. These appeals were classified as logos, pathos, and ethos based on Aristotle’s rhetorical framework (Rapp, 2022). In identifying the dominant rhetorical appeal, the full advertisement caption was examined to determine the textual elements that indicated the appeal, while the CTA phrase served as the primary unit of analysis. Table 1 presents the distribution of rhetorical appeals across the five selected skincare brands.</w:t>
       </w:r>
     </w:p>
     <w:p>
@@ -551,11 +534,9 @@
       <w:r>
         <w:rPr>
           <w:rFonts w:ascii="Georgia" w:hAnsi="Georgia" w:eastAsia="Georgia"/>
-          <w:b w:val="0"/>
-          <w:i w:val="0"/>
           <w:sz w:val="22"/>
         </w:rPr>
-        <w:t>Table 1 shows that logos had the highest frequency, with 22 instances (64.71%), followed by pathos with 11 instances (32.35%). Ethos had the lowest frequency, with only one instance (2.94%). Each of the 34 CTA phrases was classified according to its dominant rhetorical appeal. In this sample, product-related information and stated benefits supply the main textual basis for persuasion more often than emotional or credibility-framed wording.</w:t>
+        <w:t>Table 1 presents the frequency and percentage distribution of rhetorical appeals identified in the 34 analyzed call-to-action (CTA) phrases from Facebook skincare advertisement captions. The table shows that logos had the highest frequency, with 22 instances (64.71%), followed by pathos with 11 instances (32.35%). Ethos had the lowest frequency, with only one instance (2.94%). The total of 34 instances represents all the analyzed CTA phrases, with each phrase classified according to its dominant rhetorical appeal.</w:t>
       </w:r>
     </w:p>
     <w:p>
@@ -566,40 +547,10 @@
       </w:pPr>
       <w:r>
         <w:rPr>
-          <w:rFonts w:ascii="Georgia" w:hAnsi="Georgia"/>
+          <w:rFonts w:ascii="Georgia" w:hAnsi="Georgia" w:eastAsia="Georgia"/>
           <w:sz w:val="22"/>
         </w:rPr>
-        <w:t>These elements supported classification under logos because they offer reasons for considering the product. That reading is consistent with logos as persuasion through logical reasoning or argument (</w:t>
-      </w:r>
-      <w:r>
-        <w:rPr>
-          <w:rFonts w:ascii="Georgia" w:hAnsi="Georgia"/>
-          <w:sz w:val="22"/>
-          <w:highlight w:val="yellow"/>
-        </w:rPr>
-        <w:t>Rapp, 2022</w:t>
-      </w:r>
-      <w:r>
-        <w:rPr>
-          <w:rFonts w:ascii="Georgia" w:hAnsi="Georgia"/>
-          <w:sz w:val="22"/>
-        </w:rPr>
-        <w:t>) and with analyses that locate logos in facts, specifications, and product data in social-media advertising language (</w:t>
-      </w:r>
-      <w:r>
-        <w:rPr>
-          <w:rFonts w:ascii="Georgia" w:hAnsi="Georgia"/>
-          <w:sz w:val="22"/>
-          <w:highlight w:val="yellow"/>
-        </w:rPr>
-        <w:t>Nasir et al., 2025</w:t>
-      </w:r>
-      <w:r>
-        <w:rPr>
-          <w:rFonts w:ascii="Georgia" w:hAnsi="Georgia"/>
-          <w:sz w:val="22"/>
-        </w:rPr>
-        <w:t>).</w:t>
+        <w:t>These textual elements served as the basis for classifying the corresponding CTA phrases under logos because they presented product-related information and stated benefits that could serve as reasons for considering the advertised products. This interpretation is consistent with the study’s theoretical framework, in which logos refers to persuasion through logical reasoning or argument (Rapp, 2022). Similar attention to product-based and fact-oriented language appears in analyses of social media advertising (Nasir et al., 2025).</w:t>
       </w:r>
     </w:p>
     <w:p>
@@ -610,25 +561,10 @@
       </w:pPr>
       <w:r>
         <w:rPr>
-          <w:rFonts w:ascii="Georgia" w:hAnsi="Georgia"/>
+          <w:rFonts w:ascii="Georgia" w:hAnsi="Georgia" w:eastAsia="Georgia"/>
           <w:sz w:val="22"/>
         </w:rPr>
-        <w:t xml:space="preserve">Such wording appeals to desire, care, and urgency. Beauty-advertising research often finds pathos realized through aspirational appearance and affective framing (Dwiyanti, 2024). Pathos here is carried by </w:t>
-      </w:r>
-      <w:r>
-        <w:rPr>
-          <w:rFonts w:ascii="Georgia" w:hAnsi="Georgia"/>
-          <w:sz w:val="22"/>
-          <w:highlight w:val="yellow"/>
-        </w:rPr>
-        <w:t>evaluative lexis (youthful, glow, radiance) and interpersonal frames (gift, love, miss out)</w:t>
-      </w:r>
-      <w:r>
-        <w:rPr>
-          <w:rFonts w:ascii="Georgia" w:hAnsi="Georgia"/>
-          <w:sz w:val="22"/>
-        </w:rPr>
-        <w:t>.</w:t>
+        <w:t>These textual elements supported the classification of the corresponding CTA phrases under pathos because they appealed to the audience’s emotions, desires, and aspirations. This classification follows the study’s theoretical framework, which explains pathos as an appeal to the emotions of the audience (Rapp, 2022). Dwiyanti (2024) likewise found pathos frequently used in makeup and skincare video advertisements through emotional and aspirational presentation.</w:t>
       </w:r>
     </w:p>
     <w:p>
@@ -639,40 +575,10 @@
       </w:pPr>
       <w:r>
         <w:rPr>
-          <w:rFonts w:ascii="Georgia" w:hAnsi="Georgia"/>
+          <w:rFonts w:ascii="Georgia" w:hAnsi="Georgia" w:eastAsia="Georgia"/>
           <w:sz w:val="22"/>
         </w:rPr>
-        <w:t>Classification therefore rested on textual evidence of trustworthiness, not on brand identification alone. That distinction follows the definition of ethos as an appeal based on credibility (</w:t>
-      </w:r>
-      <w:r>
-        <w:rPr>
-          <w:rFonts w:ascii="Georgia" w:hAnsi="Georgia"/>
-          <w:sz w:val="22"/>
-          <w:highlight w:val="yellow"/>
-        </w:rPr>
-        <w:t>Rapp, 2022</w:t>
-      </w:r>
-      <w:r>
-        <w:rPr>
-          <w:rFonts w:ascii="Georgia" w:hAnsi="Georgia"/>
-          <w:sz w:val="22"/>
-        </w:rPr>
-        <w:t xml:space="preserve">): </w:t>
-      </w:r>
-      <w:r>
-        <w:rPr>
-          <w:rFonts w:ascii="Georgia" w:hAnsi="Georgia"/>
-          <w:sz w:val="22"/>
-          <w:highlight w:val="yellow"/>
-        </w:rPr>
-        <w:t>naming the brand is not the same as establishing trust in the wording</w:t>
-      </w:r>
-      <w:r>
-        <w:rPr>
-          <w:rFonts w:ascii="Georgia" w:hAnsi="Georgia"/>
-          <w:sz w:val="22"/>
-        </w:rPr>
-        <w:t>.</w:t>
+        <w:t>This distinction shows that the classification was based on the specific textual evidence in the advertisement captions rather than on brand identification alone. This interpretation is consistent with the theoretical definition of ethos as an appeal based on credibility and trustworthiness (Rapp, 2022).</w:t>
       </w:r>
     </w:p>
     <w:p>
@@ -683,70 +589,10 @@
       </w:pPr>
       <w:r>
         <w:rPr>
-          <w:rFonts w:ascii="Georgia" w:hAnsi="Georgia"/>
+          <w:rFonts w:ascii="Georgia" w:hAnsi="Georgia" w:eastAsia="Georgia"/>
           <w:sz w:val="22"/>
         </w:rPr>
-        <w:t xml:space="preserve">The findings can be compared with Dwiyanti (2024), who examined persuasive techniques in makeup and skincare video advertisements and found pathos most frequent, with logos and ethos less common. The present study found logos dominant. The difference is better read as a difference in </w:t>
-      </w:r>
-      <w:r>
-        <w:rPr>
-          <w:rFonts w:ascii="Georgia" w:hAnsi="Georgia"/>
-          <w:sz w:val="22"/>
-          <w:highlight w:val="yellow"/>
-        </w:rPr>
-        <w:t>material and unit of analysis—short CTA-centered Facebook captions versus multimodal video advertisements—than as a claim that the platform itself caused the shift</w:t>
-      </w:r>
-      <w:r>
-        <w:rPr>
-          <w:rFonts w:ascii="Georgia" w:hAnsi="Georgia"/>
-          <w:sz w:val="22"/>
-        </w:rPr>
-        <w:t>. Philippine Facebook advertising work has also shown ethos and pathos operating strongly in other product sectors (</w:t>
-      </w:r>
-      <w:r>
-        <w:rPr>
-          <w:rFonts w:ascii="Georgia" w:hAnsi="Georgia"/>
-          <w:sz w:val="22"/>
-          <w:highlight w:val="yellow"/>
-        </w:rPr>
-        <w:t>De Castro &amp; Martinez, 2025</w:t>
-      </w:r>
-      <w:r>
-        <w:rPr>
-          <w:rFonts w:ascii="Georgia" w:hAnsi="Georgia"/>
-          <w:sz w:val="22"/>
-        </w:rPr>
-        <w:t xml:space="preserve">; </w:t>
-      </w:r>
-      <w:r>
-        <w:rPr>
-          <w:rFonts w:ascii="Georgia" w:hAnsi="Georgia"/>
-          <w:sz w:val="22"/>
-          <w:highlight w:val="yellow"/>
-        </w:rPr>
-        <w:t>Talaue, 2022</w:t>
-      </w:r>
-      <w:r>
-        <w:rPr>
-          <w:rFonts w:ascii="Georgia" w:hAnsi="Georgia"/>
-          <w:sz w:val="22"/>
-        </w:rPr>
-        <w:t xml:space="preserve">), which further suggests that </w:t>
-      </w:r>
-      <w:r>
-        <w:rPr>
-          <w:rFonts w:ascii="Georgia" w:hAnsi="Georgia"/>
-          <w:sz w:val="22"/>
-          <w:highlight w:val="yellow"/>
-        </w:rPr>
-        <w:t>rhetorical distribution tracks discourse type and coding focus as much as product category</w:t>
-      </w:r>
-      <w:r>
-        <w:rPr>
-          <w:rFonts w:ascii="Georgia" w:hAnsi="Georgia"/>
-          <w:sz w:val="22"/>
-        </w:rPr>
-        <w:t>.</w:t>
+        <w:t>The findings can be compared with Dwiyanti (2024), who examined persuasive techniques in makeup and skincare video advertisements. In that study, pathos was the most frequently identified rhetorical appeal, whereas logos and ethos occurred less frequently. This differs from the present study, in which logos was the dominant appeal. The difference may be related to the materials and units of analysis examined in the two studies, as the present research focused specifically on CTA phrases in Facebook advertisement captions, whereas Dwiyanti (2024) examined makeup and skincare video advertisements. However, this comparison does not establish that the platform itself caused the difference. Rather, it suggests that the distribution of rhetorical appeals may vary across the advertising materials and analytical approaches used. Related work on Facebook advertising in the Philippines has also identified rhetorical appeals in other product sectors, including bank picture advertisements where ethos–logos combinations were common (De Castro &amp; Martinez, 2025). Consumer-response research further suggests that audiences may give strong weight to credibility when judging advertisements (Talaue, 2022).</w:t>
       </w:r>
     </w:p>
     <w:p>
@@ -757,25 +603,10 @@
       </w:pPr>
       <w:r>
         <w:rPr>
-          <w:rFonts w:ascii="Georgia" w:hAnsi="Georgia"/>
+          <w:rFonts w:ascii="Georgia" w:hAnsi="Georgia" w:eastAsia="Georgia"/>
           <w:sz w:val="22"/>
         </w:rPr>
-        <w:t xml:space="preserve">Overall, logos, pathos, and ethos were all present in the selected captions. Logos was the most frequent appeal, followed by pathos and ethos. The pattern is one of </w:t>
-      </w:r>
-      <w:r>
-        <w:rPr>
-          <w:rFonts w:ascii="Georgia" w:hAnsi="Georgia"/>
-          <w:sz w:val="22"/>
-          <w:highlight w:val="yellow"/>
-        </w:rPr>
-        <w:t>wording rather than market effect</w:t>
-      </w:r>
-      <w:r>
-        <w:rPr>
-          <w:rFonts w:ascii="Georgia" w:hAnsi="Georgia"/>
-          <w:sz w:val="22"/>
-        </w:rPr>
-        <w:t>: in this corpus, skincare CTAs most often build persuasion on product information and stated benefits, with emotional and credibility resources used more selectively.</w:t>
+        <w:t>Overall, logos, pathos, and ethos were identified as the rhetorical appeals present in the selected Facebook skincare advertisement captions. Logos was the most frequently identified appeal, followed by pathos and ethos. This indicates that product-related information and stated benefits were the most prominent textual bases for constructing persuasive meaning in the analyzed CTA phrases.</w:t>
       </w:r>
     </w:p>
     <w:p>
@@ -865,25 +696,10 @@
       </w:pPr>
       <w:r>
         <w:rPr>
-          <w:rFonts w:ascii="Georgia" w:hAnsi="Georgia"/>
+          <w:rFonts w:ascii="Georgia" w:hAnsi="Georgia" w:eastAsia="Georgia"/>
           <w:sz w:val="22"/>
         </w:rPr>
-        <w:t>The coding identified two directive subtypes across the 34 CTA phrases: order and suggestion. Four subtypes were available in the framework—command, order, request, and suggestion—following Yule (1996) as operationalized by Anggraini and Afriana (2023). Directives, in Searle’s taxonomy, are illocutionary acts through which the speaker attempts to get the hearer to do something (</w:t>
-      </w:r>
-      <w:r>
-        <w:rPr>
-          <w:rFonts w:ascii="Georgia" w:hAnsi="Georgia"/>
-          <w:sz w:val="22"/>
-          <w:highlight w:val="yellow"/>
-        </w:rPr>
-        <w:t>Searle, 1975, 1976</w:t>
-      </w:r>
-      <w:r>
-        <w:rPr>
-          <w:rFonts w:ascii="Georgia" w:hAnsi="Georgia"/>
-          <w:sz w:val="22"/>
-        </w:rPr>
-        <w:t>). Table 3 presents the distribution of directive subtypes across the five brands.</w:t>
+        <w:t>The coding identified two directive subtypes across the 34 call-to-action (CTA) phrases from the selected Facebook skincare advertisement captions: order and suggestion. The analysis considered four directive subtypes—command, order, request, and suggestion—based on the operational categories used in the study, following Yule (1996, as cited in Anggraini &amp; Afriana, 2023). Searle (1975, 1976) describes directives as speech acts through which the speaker attempts to get the hearer to perform an action. Table 3 presents the distribution of directive subtypes across the five selected skincare brands.</w:t>
       </w:r>
     </w:p>
     <w:p>
@@ -1449,7 +1265,6 @@
         <w:rPr>
           <w:rFonts w:ascii="Georgia" w:hAnsi="Georgia"/>
           <w:sz w:val="22"/>
-          <w:highlight w:val="yellow"/>
         </w:rPr>
         <w:t>utterance that performs a social action, not only as promotional copy</w:t>
       </w:r>
@@ -1469,40 +1284,10 @@
       </w:pPr>
       <w:r>
         <w:rPr>
-          <w:rFonts w:ascii="Georgia" w:hAnsi="Georgia"/>
+          <w:rFonts w:ascii="Georgia" w:hAnsi="Georgia" w:eastAsia="Georgia"/>
           <w:sz w:val="22"/>
         </w:rPr>
-        <w:t xml:space="preserve">Orders directed consumers toward concrete commercial actions: checking out products, shopping, choosing from a range, adding items to a cart, exploring a website, applying a product, or obtaining an item online. Examples include Olay’s “Shop now at Watsons, S&amp;R, Robinsons Department Store, Landmark Department Store, Shopee and Lazada” and The Ordinary’s “Discover now via theordinary.com.” These were classified as orders because they directly instruct the audience to perform a specific action. Advertising research on imperatives notes that commercial directives often take short, verb-led English forms and that their </w:t>
-      </w:r>
-      <w:r>
-        <w:rPr>
-          <w:rFonts w:ascii="Georgia" w:hAnsi="Georgia"/>
-          <w:sz w:val="22"/>
-          <w:highlight w:val="yellow"/>
-        </w:rPr>
-        <w:t>force may function more like instruction or recommendation than institutional command</w:t>
-      </w:r>
-      <w:r>
-        <w:rPr>
-          <w:rFonts w:ascii="Georgia" w:hAnsi="Georgia"/>
-          <w:sz w:val="22"/>
-        </w:rPr>
-        <w:t xml:space="preserve"> (</w:t>
-      </w:r>
-      <w:r>
-        <w:rPr>
-          <w:rFonts w:ascii="Georgia" w:hAnsi="Georgia"/>
-          <w:sz w:val="22"/>
-          <w:highlight w:val="yellow"/>
-        </w:rPr>
-        <w:t>Pennock-Speck &amp; Fuster-Márquez, 2014</w:t>
-      </w:r>
-      <w:r>
-        <w:rPr>
-          <w:rFonts w:ascii="Georgia" w:hAnsi="Georgia"/>
-          <w:sz w:val="22"/>
-        </w:rPr>
-        <w:t>).</w:t>
+        <w:t>A closer examination of order showed that it appeared in 22 CTA phrases across the five brands. These CTA phrases commonly directed consumers to perform actions such as checking out products, shopping, choosing from a product range, adding products to a cart, exploring a website, and obtaining advertised products. For example, Olay used “Shop now at Watsons, S&amp;R, Robinsons Department Store, Landmark Department Store, Shopee and Lazada,” which directs consumers to shop for the advertised products. Similarly, The Ordinary used “Discover now via theordinary.com” to direct the audience to explore the product through its website. These expressions were classified as orders because they directly instruct the audience to perform a specific action related to the advertised products. Research on imperatives in advertising has also noted that such forms often function more like advice or recommendation than strict commands (Pennock-Speck &amp; Fuster-Márquez, 2014).</w:t>
       </w:r>
     </w:p>
     <w:p>
@@ -1522,7 +1307,6 @@
         <w:rPr>
           <w:rFonts w:ascii="Georgia" w:hAnsi="Georgia"/>
           <w:sz w:val="22"/>
-          <w:highlight w:val="yellow"/>
         </w:rPr>
         <w:t>imperative surface (Try, Give, Experience) but carries lower directive force than order</w:t>
       </w:r>
@@ -1542,25 +1326,10 @@
       </w:pPr>
       <w:r>
         <w:rPr>
-          <w:rFonts w:ascii="Georgia" w:hAnsi="Georgia"/>
+          <w:rFonts w:ascii="Georgia" w:hAnsi="Georgia" w:eastAsia="Georgia"/>
           <w:sz w:val="22"/>
         </w:rPr>
-        <w:t>No instances of command or request met the operational criteria. Command, in the adopted framework, implies a stronger authority asymmetry; request implies a more polite ask. Commercial Facebook CTAs in this sample clustered instead on order and suggestion. That pattern is consistent with advertising English that prefers clear action prompts without the interpersonal softening typical of polite requests or the institutional force of true commands (</w:t>
-      </w:r>
-      <w:r>
-        <w:rPr>
-          <w:rFonts w:ascii="Georgia" w:hAnsi="Georgia"/>
-          <w:sz w:val="22"/>
-          <w:highlight w:val="yellow"/>
-        </w:rPr>
-        <w:t>Pennock-Speck &amp; Fuster-Márquez, 2014</w:t>
-      </w:r>
-      <w:r>
-        <w:rPr>
-          <w:rFonts w:ascii="Georgia" w:hAnsi="Georgia"/>
-          <w:sz w:val="22"/>
-        </w:rPr>
-        <w:t>).</w:t>
+        <w:t>No instances of command or request were identified in the dataset. Although these subtypes were included in the classification framework, none of the selected CTA phrases was classified under either category based on the operational criteria applied in the analysis. The findings therefore show that the identified directive language was concentrated on orders and suggestions, with orders occurring more frequently. This pattern is consistent with research noting that advertising imperatives often work as clear prompts rather than as formal commands or polite requests (Pennock-Speck &amp; Fuster-Márquez, 2014).</w:t>
       </w:r>
     </w:p>
     <w:p>
@@ -1572,11 +1341,9 @@
       <w:r>
         <w:rPr>
           <w:rFonts w:ascii="Georgia" w:hAnsi="Georgia" w:eastAsia="Georgia"/>
-          <w:b w:val="0"/>
-          <w:i w:val="0"/>
           <w:sz w:val="22"/>
         </w:rPr>
-        <w:t>Overall, order dominated and suggestion was secondary. The selected advertisements mainly use direct instruction and, less often, recommended consideration. Command and request were available in the scheme but did not appear in the data.</w:t>
+        <w:t>Overall, the findings showed that order was the dominant directive subtype, accounting for 22 of the 34 CTA phrases (64.71%), while suggestion accounted for 12 instances (35.29%). This distribution indicates that the selected Facebook skincare advertisements commonly used direct instructions to encourage consumers to take action toward the advertised products. Suggestions were also used to encourage consumers to consider trying products or incorporating them into their skincare routines. Thus, the findings answered the second research question by showing that order and suggestion were the directive subtypes identified in the analyzed CTA phrases, while command and request were not observed.</w:t>
       </w:r>
     </w:p>
     <w:p>
@@ -1666,25 +1433,10 @@
       </w:pPr>
       <w:r>
         <w:rPr>
-          <w:rFonts w:ascii="Georgia" w:hAnsi="Georgia"/>
+          <w:rFonts w:ascii="Georgia" w:hAnsi="Georgia" w:eastAsia="Georgia"/>
           <w:sz w:val="22"/>
         </w:rPr>
-        <w:t xml:space="preserve">Part III examines how rhetorical appeals and directive subtypes combine in the 34 CTA phrases. Persuasive meaning is treated as </w:t>
-      </w:r>
-      <w:r>
-        <w:rPr>
-          <w:rFonts w:ascii="Georgia" w:hAnsi="Georgia"/>
-          <w:sz w:val="22"/>
-          <w:highlight w:val="yellow"/>
-        </w:rPr>
-        <w:t>jointly constructed: the appeal supplies a reason, emotion, or credibility frame, while the directive subtype supplies the illocutionary force that seeks audience action</w:t>
-      </w:r>
-      <w:r>
-        <w:rPr>
-          <w:rFonts w:ascii="Georgia" w:hAnsi="Georgia"/>
-          <w:sz w:val="22"/>
-        </w:rPr>
-        <w:t>. Table 5 presents the frequency and percentage distribution of these combinations.</w:t>
+        <w:t>The analysis examined how rhetorical appeals and directive subtypes were combined in the 34 call-to-action (CTA) phrases from the selected Facebook skincare advertisement captions. The findings revealed different combinations of rhetorical appeals and directive subtypes, with some combinations occurring more frequently than others. Table 5 presents the frequency and percentage distribution of these combinations.</w:t>
       </w:r>
     </w:p>
     <w:p>
@@ -2324,98 +2076,10 @@
       </w:pPr>
       <w:r>
         <w:rPr>
-          <w:rFonts w:ascii="Georgia" w:hAnsi="Georgia"/>
+          <w:rFonts w:ascii="Georgia" w:hAnsi="Georgia" w:eastAsia="Georgia"/>
           <w:sz w:val="22"/>
         </w:rPr>
-        <w:t xml:space="preserve">Logos + Order was the most frequent combination (15; 44.12%), followed by Logos + Suggestion (7; 20.59%), Pathos + Order (6; 17.65%), Pathos + Suggestion (5; 14.71%), and Ethos + Order (1; 2.94%). Studies that integrate rhetorical appeals with speech-act analysis in cosmetics and social-media advertising similarly treat persuasion as multi-layered: </w:t>
-      </w:r>
-      <w:r>
-        <w:rPr>
-          <w:rFonts w:ascii="Georgia" w:hAnsi="Georgia"/>
-          <w:sz w:val="22"/>
-          <w:highlight w:val="yellow"/>
-        </w:rPr>
-        <w:t>ads both argue and direct</w:t>
-      </w:r>
-      <w:r>
-        <w:rPr>
-          <w:rFonts w:ascii="Georgia" w:hAnsi="Georgia"/>
-          <w:sz w:val="22"/>
-        </w:rPr>
-        <w:t xml:space="preserve"> (</w:t>
-      </w:r>
-      <w:r>
-        <w:rPr>
-          <w:rFonts w:ascii="Georgia" w:hAnsi="Georgia"/>
-          <w:sz w:val="22"/>
-          <w:highlight w:val="yellow"/>
-        </w:rPr>
-        <w:t>Saad &amp; Ismael, 2025</w:t>
-      </w:r>
-      <w:r>
-        <w:rPr>
-          <w:rFonts w:ascii="Georgia" w:hAnsi="Georgia"/>
-          <w:sz w:val="22"/>
-        </w:rPr>
-        <w:t>; related work on social-media cosmetics advertising). The present distribution specifies how that layering appears in English CTA phrases for five skincare brands on Facebook.</w:t>
-      </w:r>
-    </w:p>
-    <w:p>
-      <w:pPr>
-        <w:spacing w:line="480" w:lineRule="auto" w:before="0" w:after="0"/>
-        <w:ind w:firstLine="720"/>
-        <w:jc w:val="both"/>
-      </w:pPr>
-      <w:r>
-        <w:rPr>
-          <w:rFonts w:ascii="Georgia" w:hAnsi="Georgia"/>
-          <w:sz w:val="22"/>
-        </w:rPr>
-        <w:t xml:space="preserve">This combination typically offers a product reason (ingredient, benefit, SPF, price) and simultaneously performs an order (Shop now, Apply, Discover). Logos supplies the informational basis; order directs the intended action. Logos + Suggestion, found in The Ordinary, Myra, and Pond’s, keeps the informational basis but softens the directive to an action the consumer may consider. Pathos + Order links desirable outcomes or affective frames with direct instruction, while Pathos + Suggestion links those frames with invited consideration. Ethos + Order appeared once in Myra, where explicit trust language accompanied a direct instruction. In each case, persuasive meaning is not appeal alone or directive alone; it is the </w:t>
-      </w:r>
-      <w:r>
-        <w:rPr>
-          <w:rFonts w:ascii="Georgia" w:hAnsi="Georgia"/>
-          <w:sz w:val="22"/>
-          <w:highlight w:val="yellow"/>
-        </w:rPr>
-        <w:t>packaging of both in one CTA unit</w:t>
-      </w:r>
-      <w:r>
-        <w:rPr>
-          <w:rFonts w:ascii="Georgia" w:hAnsi="Georgia"/>
-          <w:sz w:val="22"/>
-        </w:rPr>
-        <w:t>.</w:t>
-      </w:r>
-    </w:p>
-    <w:p>
-      <w:pPr>
-        <w:spacing w:line="480" w:lineRule="auto" w:before="0" w:after="0"/>
-        <w:ind w:firstLine="720"/>
-        <w:jc w:val="both"/>
-      </w:pPr>
-      <w:r>
-        <w:rPr>
-          <w:rFonts w:ascii="Georgia" w:hAnsi="Georgia"/>
-          <w:sz w:val="22"/>
-        </w:rPr>
-        <w:t xml:space="preserve">Brand-level patterns refine the picture without changing the overall claim. Olay combined pathos or logos with order only. The Ordinary stayed within logos, paired with order or suggestion. Myra showed the widest mix, including the sole ethos case and a higher share of suggestion. Pond’s and Luxe Organix mixed logos- and pathos-based combinations. These are </w:t>
-      </w:r>
-      <w:r>
-        <w:rPr>
-          <w:rFonts w:ascii="Georgia" w:hAnsi="Georgia"/>
-          <w:sz w:val="22"/>
-          <w:highlight w:val="yellow"/>
-        </w:rPr>
-        <w:t>patterns of caption wording, not measures of campaign success</w:t>
-      </w:r>
-      <w:r>
-        <w:rPr>
-          <w:rFonts w:ascii="Georgia" w:hAnsi="Georgia"/>
-          <w:sz w:val="22"/>
-        </w:rPr>
-        <w:t>.</w:t>
+        <w:t>Table 5 shows that Logos + Order was the most frequent combination, occurring in 15 of the 34 CTA phrases (44.12%). This was followed by Logos + Suggestion, with seven occurrences (20.59%); Pathos + Order, with six occurrences (17.65%); Pathos + Suggestion, with five occurrences (14.71%); and Ethos + Order, with one occurrence (2.94%). These findings indicate that logos were commonly paired with both orders and suggestions, while pathos was also combined with both directive subtypes. Ethos appeared only with order in the final classifications. Related studies on cosmetics advertising in social media have likewise examined how rhetorical appeals and speech acts work together in promotional messages (Saad &amp; Ismael, 2025).</w:t>
       </w:r>
     </w:p>
     <w:p>
@@ -2427,11 +2091,37 @@
       <w:r>
         <w:rPr>
           <w:rFonts w:ascii="Georgia" w:hAnsi="Georgia" w:eastAsia="Georgia"/>
-          <w:b w:val="0"/>
-          <w:i w:val="0"/>
           <w:sz w:val="22"/>
         </w:rPr>
-        <w:t>Overall, persuasive meaning in the selected Facebook skincare advertisements was constructed through the combination of rhetorical appeals and directive subtypes. Logos presented product-related information, pathos appealed to feelings and desired appearance, and ethos conveyed credibility when the wording supported it. Orders directed specific actions; suggestions invited consideration. The analysis does not establish whether consumers purchased or used the products.</w:t>
+        <w:t>The most frequent combination, Logos + Order, appeared in Olay, Luxe Organix, The Ordinary, and Pond’s. This combination presented product-related information alongside a direct instruction. For example, CTA phrases that mention product benefits and direct consumers to shop for or use a product connect information about the advertised product with a specific action. In this combination, logos provide the informational basis of the promotional message, while order directs consumers toward the intended action. The second combination, Logos + Suggestion, occurred in The Ordinary, Myra, and Pond’s. This combination presented product-related information while inviting consumers to consider an action. Unlike an order, a suggestion allows consumers to consider the proposed action rather than presenting it as a direct instruction. Pathos + Order appeared in Olay, Luxe Organix, and Myra. This combination used emotional expressions or desirable outcomes alongside direct instructions. Pathos + Suggestion appeared in Luxe Organix, Myra, and Pond’s. This combination appealed to consumers’ feelings or desired appearance while inviting them to consider a product or action. Finally, Ethos + Order appeared once in Myra. This combination connected a credibility-related appeal with a direct instruction.</w:t>
+      </w:r>
+    </w:p>
+    <w:p>
+      <w:pPr>
+        <w:spacing w:line="480" w:lineRule="auto" w:before="0" w:after="0"/>
+        <w:ind w:firstLine="720"/>
+        <w:jc w:val="both"/>
+      </w:pPr>
+      <w:r>
+        <w:rPr>
+          <w:rFonts w:ascii="Georgia" w:hAnsi="Georgia" w:eastAsia="Georgia"/>
+          <w:sz w:val="22"/>
+        </w:rPr>
+        <w:t>These combinations helped connect the advertisements’ promotional messages with the actions encouraged by the CTA phrases. Across brands, the pairings varied: Olay combined pathos or logos with order; The Ordinary remained within logos, paired with order or suggestion; Myra showed a wider mix, including the single ethos case; and Pond’s and Luxe Organix mixed logos-based and pathos-based combinations.</w:t>
+      </w:r>
+    </w:p>
+    <w:p>
+      <w:pPr>
+        <w:spacing w:line="480" w:lineRule="auto" w:before="0" w:after="0"/>
+        <w:ind w:firstLine="720"/>
+        <w:jc w:val="both"/>
+      </w:pPr>
+      <w:r>
+        <w:rPr>
+          <w:rFonts w:ascii="Georgia" w:hAnsi="Georgia" w:eastAsia="Georgia"/>
+          <w:sz w:val="22"/>
+        </w:rPr>
+        <w:t>Overall, the findings show that persuasive meaning in the selected Facebook skincare advertisements was constructed through the combination of rhetorical appeals and directive subtypes. Logos presented product-related information, pathos appealed to consumers’ feelings and desired appearance, and ethos conveyed credibility when supported by the message. Meanwhile, orders directed consumers toward specific actions, while suggestions invited them to consider an action. However, this analysis focuses on the persuasive language used in the advertisements and does not establish whether consumers actually purchased or used the products.</w:t>
       </w:r>
     </w:p>
     <w:p>

</xml_diff>